<commit_message>
Update docs; add presentation and test report
Updated several project documents (meeting minutes, progress report, SDD, SPPP, SPPP risk management, and STD) and added two new files: CS673_presentation2_team3.pptx and Manual Testing Report.xlsx. These are binary document changes reflecting content updates and the inclusion of the presentation and manual testing results.
</commit_message>
<xml_diff>
--- a/doc/CS673_SPPP_team3.docx
+++ b/doc/CS673_SPPP_team3.docx
@@ -3276,6 +3276,210 @@
           </w:p>
         </w:tc>
       </w:tr>
+      <w:tr>
+        <w:trPr>
+          <w:cantSplit w:val="0"/>
+          <w:tblHeader w:val="0"/>
+        </w:trPr>
+        <w:tc>
+          <w:tcPr>
+            <w:shd w:fill="auto" w:val="clear"/>
+            <w:tcMar>
+              <w:top w:w="100.0" w:type="dxa"/>
+              <w:left w:w="100.0" w:type="dxa"/>
+              <w:bottom w:w="100.0" w:type="dxa"/>
+              <w:right w:w="100.0" w:type="dxa"/>
+            </w:tcMar>
+            <w:vAlign w:val="top"/>
+          </w:tcPr>
+          <w:p>
+            <w:pPr>
+              <w:keepNext w:val="0"/>
+              <w:keepLines w:val="0"/>
+              <w:pageBreakBefore w:val="0"/>
+              <w:widowControl w:val="0"/>
+              <w:pBdr>
+                <w:top w:space="0" w:sz="0" w:val="nil"/>
+                <w:left w:space="0" w:sz="0" w:val="nil"/>
+                <w:bottom w:space="0" w:sz="0" w:val="nil"/>
+                <w:right w:space="0" w:sz="0" w:val="nil"/>
+                <w:between w:space="0" w:sz="0" w:val="nil"/>
+              </w:pBdr>
+              <w:shd w:fill="auto" w:val="clear"/>
+              <w:spacing w:after="0" w:before="0" w:line="276" w:lineRule="auto"/>
+              <w:ind w:left="0" w:right="0" w:firstLine="0"/>
+              <w:jc w:val="left"/>
+              <w:rPr>
+                <w:rFonts w:ascii="Times New Roman" w:cs="Times New Roman" w:eastAsia="Times New Roman" w:hAnsi="Times New Roman"/>
+                <w:b w:val="1"/>
+                <w:bCs w:val="1"/>
+                <w:sz w:val="24"/>
+                <w:szCs w:val="24"/>
+                <w:u w:val="single"/>
+              </w:rPr>
+            </w:pPr>
+            <w:r>
+              <w:rPr>
+                <w:rFonts w:ascii="Times New Roman" w:cs="Times New Roman" w:eastAsia="Times New Roman" w:hAnsi="Times New Roman"/>
+                <w:b w:val="1"/>
+                <w:bCs w:val="1"/>
+                <w:sz w:val="24"/>
+                <w:szCs w:val="24"/>
+                <w:u w:val="single"/>
+                <w:rtl w:val="0"/>
+              </w:rPr>
+              <w:t xml:space="preserve">2.0</w:t>
+            </w:r>
+          </w:p>
+        </w:tc>
+        <w:tc>
+          <w:tcPr>
+            <w:shd w:fill="auto" w:val="clear"/>
+            <w:tcMar>
+              <w:top w:w="100.0" w:type="dxa"/>
+              <w:left w:w="100.0" w:type="dxa"/>
+              <w:bottom w:w="100.0" w:type="dxa"/>
+              <w:right w:w="100.0" w:type="dxa"/>
+            </w:tcMar>
+            <w:vAlign w:val="top"/>
+          </w:tcPr>
+          <w:p>
+            <w:pPr>
+              <w:keepNext w:val="0"/>
+              <w:keepLines w:val="0"/>
+              <w:pageBreakBefore w:val="0"/>
+              <w:widowControl w:val="0"/>
+              <w:pBdr>
+                <w:top w:space="0" w:sz="0" w:val="nil"/>
+                <w:left w:space="0" w:sz="0" w:val="nil"/>
+                <w:bottom w:space="0" w:sz="0" w:val="nil"/>
+                <w:right w:space="0" w:sz="0" w:val="nil"/>
+                <w:between w:space="0" w:sz="0" w:val="nil"/>
+              </w:pBdr>
+              <w:shd w:fill="auto" w:val="clear"/>
+              <w:spacing w:after="0" w:before="0" w:line="276" w:lineRule="auto"/>
+              <w:ind w:left="0" w:right="0" w:firstLine="0"/>
+              <w:jc w:val="left"/>
+              <w:rPr>
+                <w:rFonts w:ascii="Times New Roman" w:cs="Times New Roman" w:eastAsia="Times New Roman" w:hAnsi="Times New Roman"/>
+                <w:b w:val="1"/>
+                <w:bCs w:val="1"/>
+                <w:sz w:val="24"/>
+                <w:szCs w:val="24"/>
+                <w:u w:val="single"/>
+              </w:rPr>
+            </w:pPr>
+            <w:r>
+              <w:rPr>
+                <w:rFonts w:ascii="Times New Roman" w:cs="Times New Roman" w:eastAsia="Times New Roman" w:hAnsi="Times New Roman"/>
+                <w:b w:val="1"/>
+                <w:bCs w:val="1"/>
+                <w:sz w:val="24"/>
+                <w:szCs w:val="24"/>
+                <w:u w:val="single"/>
+                <w:rtl w:val="0"/>
+              </w:rPr>
+              <w:t xml:space="preserve">Vy Trinh</w:t>
+            </w:r>
+          </w:p>
+        </w:tc>
+        <w:tc>
+          <w:tcPr>
+            <w:shd w:fill="auto" w:val="clear"/>
+            <w:tcMar>
+              <w:top w:w="100.0" w:type="dxa"/>
+              <w:left w:w="100.0" w:type="dxa"/>
+              <w:bottom w:w="100.0" w:type="dxa"/>
+              <w:right w:w="100.0" w:type="dxa"/>
+            </w:tcMar>
+            <w:vAlign w:val="top"/>
+          </w:tcPr>
+          <w:p>
+            <w:pPr>
+              <w:keepNext w:val="0"/>
+              <w:keepLines w:val="0"/>
+              <w:pageBreakBefore w:val="0"/>
+              <w:widowControl w:val="0"/>
+              <w:pBdr>
+                <w:top w:space="0" w:sz="0" w:val="nil"/>
+                <w:left w:space="0" w:sz="0" w:val="nil"/>
+                <w:bottom w:space="0" w:sz="0" w:val="nil"/>
+                <w:right w:space="0" w:sz="0" w:val="nil"/>
+                <w:between w:space="0" w:sz="0" w:val="nil"/>
+              </w:pBdr>
+              <w:shd w:fill="auto" w:val="clear"/>
+              <w:spacing w:after="0" w:before="0" w:line="276" w:lineRule="auto"/>
+              <w:ind w:left="0" w:right="0" w:firstLine="0"/>
+              <w:jc w:val="left"/>
+              <w:rPr>
+                <w:rFonts w:ascii="Times New Roman" w:cs="Times New Roman" w:eastAsia="Times New Roman" w:hAnsi="Times New Roman"/>
+                <w:b w:val="1"/>
+                <w:bCs w:val="1"/>
+                <w:sz w:val="24"/>
+                <w:szCs w:val="24"/>
+                <w:u w:val="single"/>
+              </w:rPr>
+            </w:pPr>
+            <w:r>
+              <w:rPr>
+                <w:rFonts w:ascii="Times New Roman" w:cs="Times New Roman" w:eastAsia="Times New Roman" w:hAnsi="Times New Roman"/>
+                <w:b w:val="1"/>
+                <w:bCs w:val="1"/>
+                <w:sz w:val="24"/>
+                <w:szCs w:val="24"/>
+                <w:u w:val="single"/>
+                <w:rtl w:val="0"/>
+              </w:rPr>
+              <w:t xml:space="preserve">06/07/2026</w:t>
+            </w:r>
+          </w:p>
+        </w:tc>
+        <w:tc>
+          <w:tcPr>
+            <w:shd w:fill="auto" w:val="clear"/>
+            <w:tcMar>
+              <w:top w:w="100.0" w:type="dxa"/>
+              <w:left w:w="100.0" w:type="dxa"/>
+              <w:bottom w:w="100.0" w:type="dxa"/>
+              <w:right w:w="100.0" w:type="dxa"/>
+            </w:tcMar>
+            <w:vAlign w:val="top"/>
+          </w:tcPr>
+          <w:p>
+            <w:pPr>
+              <w:keepNext w:val="0"/>
+              <w:keepLines w:val="0"/>
+              <w:pageBreakBefore w:val="0"/>
+              <w:widowControl w:val="0"/>
+              <w:pBdr>
+                <w:top w:space="0" w:sz="0" w:val="nil"/>
+                <w:left w:space="0" w:sz="0" w:val="nil"/>
+                <w:bottom w:space="0" w:sz="0" w:val="nil"/>
+                <w:right w:space="0" w:sz="0" w:val="nil"/>
+                <w:between w:space="0" w:sz="0" w:val="nil"/>
+              </w:pBdr>
+              <w:shd w:fill="auto" w:val="clear"/>
+              <w:spacing w:after="0" w:before="0" w:line="276" w:lineRule="auto"/>
+              <w:ind w:left="0" w:right="0" w:firstLine="0"/>
+              <w:jc w:val="left"/>
+              <w:rPr>
+                <w:rFonts w:ascii="Times New Roman" w:cs="Times New Roman" w:eastAsia="Times New Roman" w:hAnsi="Times New Roman"/>
+                <w:sz w:val="24"/>
+                <w:szCs w:val="24"/>
+              </w:rPr>
+            </w:pPr>
+            <w:r>
+              <w:rPr>
+                <w:rFonts w:ascii="Times New Roman" w:cs="Times New Roman" w:eastAsia="Times New Roman" w:hAnsi="Times New Roman"/>
+                <w:sz w:val="24"/>
+                <w:szCs w:val="24"/>
+                <w:rtl w:val="0"/>
+              </w:rPr>
+              <w:t xml:space="preserve">Added MongoDB Atlas setup and integration, user story persistence layer, frontend-backend API integration, vector database connection, form validation, test generation UI implementation, and updated project status for AI Test Case Generator workflow</w:t>
+            </w:r>
+          </w:p>
+        </w:tc>
+      </w:tr>
     </w:tbl>
     <w:p>
       <w:pPr>
@@ -3310,7 +3514,7 @@
     </w:p>
     <w:sdt>
       <w:sdtPr>
-        <w:id w:val="-1806070786"/>
+        <w:id w:val="-971944132"/>
         <w:docPartObj>
           <w:docPartGallery w:val="Table of Contents"/>
           <w:docPartUnique w:val="1"/>
@@ -3387,7 +3591,7 @@
     </w:p>
     <w:sdt>
       <w:sdtPr>
-        <w:id w:val="1912311151"/>
+        <w:id w:val="1353406252"/>
         <w:docPartObj>
           <w:docPartGallery w:val="Table of Contents"/>
           <w:docPartUnique w:val="1"/>
@@ -4570,6 +4774,7 @@
         </w:rPr>
       </w:pPr>
       <w:commentRangeStart w:id="0"/>
+      <w:commentRangeStart w:id="1"/>
       <w:r>
         <w:rPr>
           <w:rFonts w:ascii="Times New Roman" w:cs="Times New Roman" w:eastAsia="Times New Roman" w:hAnsi="Times New Roman"/>
@@ -4584,6 +4789,10 @@
       <w:commentRangeEnd w:id="0"/>
       <w:r>
         <w:commentReference w:id="0"/>
+      </w:r>
+      <w:commentRangeEnd w:id="1"/>
+      <w:r>
+        <w:commentReference w:id="1"/>
       </w:r>
       <w:r>
         <w:rPr>
@@ -6264,11 +6473,14 @@
           <w:b w:val="0"/>
           <w:bCs w:val="0"/>
           <w:color w:val="000000"/>
-          <w:sz w:val="24"/>
-          <w:szCs w:val="24"/>
-          <w:rtl w:val="0"/>
-        </w:rPr>
-        <w:t xml:space="preserve">In Progress</w:t>
+          <w:rtl w:val="0"/>
+        </w:rPr>
+        <w:t xml:space="preserve">Completed</w:t>
+      </w:r>
+      <w:r>
+        <w:rPr>
+          <w:rtl w:val="0"/>
+        </w:rPr>
       </w:r>
     </w:p>
     <w:p>
@@ -6598,25 +6810,10 @@
         </w:rPr>
         <w:t xml:space="preserve">This architecture improves the relevance, consistency, and technical accuracy of generated test cases across the project.</w:t>
       </w:r>
-    </w:p>
-    <w:p>
-      <w:pPr>
-        <w:spacing w:line="276" w:lineRule="auto"/>
-        <w:ind w:left="2160" w:firstLine="0"/>
-        <w:rPr>
-          <w:rFonts w:ascii="Times New Roman" w:cs="Times New Roman" w:eastAsia="Times New Roman" w:hAnsi="Times New Roman"/>
-          <w:sz w:val="24"/>
-          <w:szCs w:val="24"/>
-        </w:rPr>
-      </w:pPr>
-      <w:r>
-        <w:rPr>
-          <w:rFonts w:ascii="Times New Roman" w:cs="Times New Roman" w:eastAsia="Times New Roman" w:hAnsi="Times New Roman"/>
-          <w:sz w:val="24"/>
-          <w:szCs w:val="24"/>
-          <w:rtl w:val="0"/>
-        </w:rPr>
-        <w:t xml:space="preserve"> </w:t>
+      <w:r>
+        <w:rPr>
+          <w:rtl w:val="0"/>
+        </w:rPr>
       </w:r>
     </w:p>
     <w:p>
@@ -6764,17 +6961,12 @@
           <w:color w:val="000000"/>
           <w:rtl w:val="0"/>
         </w:rPr>
-        <w:t xml:space="preserve"> </w:t>
-      </w:r>
-      <w:r>
-        <w:rPr>
-          <w:rFonts w:ascii="Times New Roman" w:cs="Times New Roman" w:eastAsia="Times New Roman" w:hAnsi="Times New Roman"/>
-          <w:b w:val="0"/>
-          <w:bCs w:val="0"/>
-          <w:color w:val="000000"/>
-          <w:rtl w:val="0"/>
-        </w:rPr>
-        <w:t xml:space="preserve">In Progress</w:t>
+        <w:t xml:space="preserve"> Completed</w:t>
+      </w:r>
+      <w:r>
+        <w:rPr>
+          <w:rtl w:val="0"/>
+        </w:rPr>
       </w:r>
     </w:p>
     <w:p>
@@ -6976,16 +7168,17 @@
           <w:rFonts w:ascii="Times New Roman" w:cs="Times New Roman" w:eastAsia="Times New Roman" w:hAnsi="Times New Roman"/>
           <w:sz w:val="24"/>
           <w:szCs w:val="24"/>
-        </w:rPr>
-      </w:pPr>
-      <w:r>
-        <w:rPr>
-          <w:rFonts w:ascii="Times New Roman" w:cs="Times New Roman" w:eastAsia="Times New Roman" w:hAnsi="Times New Roman"/>
-          <w:sz w:val="24"/>
-          <w:szCs w:val="24"/>
-          <w:rtl w:val="0"/>
-        </w:rPr>
-        <w:t xml:space="preserve">negative test cases</w:t>
+          <w:u w:val="none"/>
+        </w:rPr>
+      </w:pPr>
+      <w:r>
+        <w:rPr>
+          <w:rFonts w:ascii="Times New Roman" w:cs="Times New Roman" w:eastAsia="Times New Roman" w:hAnsi="Times New Roman"/>
+          <w:sz w:val="24"/>
+          <w:szCs w:val="24"/>
+          <w:rtl w:val="0"/>
+        </w:rPr>
+        <w:t xml:space="preserve">Positive test cases</w:t>
       </w:r>
     </w:p>
     <w:p>
@@ -7009,6 +7202,30 @@
           <w:szCs w:val="24"/>
           <w:rtl w:val="0"/>
         </w:rPr>
+        <w:t xml:space="preserve">negative test cases</w:t>
+      </w:r>
+    </w:p>
+    <w:p>
+      <w:pPr>
+        <w:numPr>
+          <w:ilvl w:val="0"/>
+          <w:numId w:val="13"/>
+        </w:numPr>
+        <w:spacing w:after="0" w:afterAutospacing="0" w:before="0" w:beforeAutospacing="0" w:line="276" w:lineRule="auto"/>
+        <w:ind w:left="2160.0000000000005" w:firstLine="0"/>
+        <w:rPr>
+          <w:rFonts w:ascii="Times New Roman" w:cs="Times New Roman" w:eastAsia="Times New Roman" w:hAnsi="Times New Roman"/>
+          <w:sz w:val="24"/>
+          <w:szCs w:val="24"/>
+        </w:rPr>
+      </w:pPr>
+      <w:r>
+        <w:rPr>
+          <w:rFonts w:ascii="Times New Roman" w:cs="Times New Roman" w:eastAsia="Times New Roman" w:hAnsi="Times New Roman"/>
+          <w:sz w:val="24"/>
+          <w:szCs w:val="24"/>
+          <w:rtl w:val="0"/>
+        </w:rPr>
         <w:t xml:space="preserve">edge-case scenarios</w:t>
       </w:r>
     </w:p>
@@ -7110,22 +7327,47 @@
           <w:ilvl w:val="0"/>
           <w:numId w:val="14"/>
         </w:numPr>
+        <w:spacing w:after="0" w:afterAutospacing="0" w:before="0" w:beforeAutospacing="0" w:line="276" w:lineRule="auto"/>
+        <w:ind w:left="2160.0000000000005" w:firstLine="0"/>
+        <w:rPr>
+          <w:rFonts w:ascii="Times New Roman" w:cs="Times New Roman" w:eastAsia="Times New Roman" w:hAnsi="Times New Roman"/>
+          <w:sz w:val="24"/>
+          <w:szCs w:val="24"/>
+        </w:rPr>
+      </w:pPr>
+      <w:r>
+        <w:rPr>
+          <w:rFonts w:ascii="Times New Roman" w:cs="Times New Roman" w:eastAsia="Times New Roman" w:hAnsi="Times New Roman"/>
+          <w:sz w:val="24"/>
+          <w:szCs w:val="24"/>
+          <w:rtl w:val="0"/>
+        </w:rPr>
+        <w:t xml:space="preserve">coverage analysis</w:t>
+      </w:r>
+    </w:p>
+    <w:p>
+      <w:pPr>
+        <w:numPr>
+          <w:ilvl w:val="0"/>
+          <w:numId w:val="14"/>
+        </w:numPr>
         <w:spacing w:after="240" w:before="0" w:beforeAutospacing="0" w:line="276" w:lineRule="auto"/>
         <w:ind w:left="2160.0000000000005" w:firstLine="0"/>
         <w:rPr>
           <w:rFonts w:ascii="Times New Roman" w:cs="Times New Roman" w:eastAsia="Times New Roman" w:hAnsi="Times New Roman"/>
           <w:sz w:val="24"/>
           <w:szCs w:val="24"/>
-        </w:rPr>
-      </w:pPr>
-      <w:r>
-        <w:rPr>
-          <w:rFonts w:ascii="Times New Roman" w:cs="Times New Roman" w:eastAsia="Times New Roman" w:hAnsi="Times New Roman"/>
-          <w:sz w:val="24"/>
-          <w:szCs w:val="24"/>
-          <w:rtl w:val="0"/>
-        </w:rPr>
-        <w:t xml:space="preserve">coverage analysis</w:t>
+          <w:u w:val="none"/>
+        </w:rPr>
+      </w:pPr>
+      <w:r>
+        <w:rPr>
+          <w:rFonts w:ascii="Times New Roman" w:cs="Times New Roman" w:eastAsia="Times New Roman" w:hAnsi="Times New Roman"/>
+          <w:sz w:val="24"/>
+          <w:szCs w:val="24"/>
+          <w:rtl w:val="0"/>
+        </w:rPr>
+        <w:t xml:space="preserve">Export functionality</w:t>
       </w:r>
       <w:r>
         <w:rPr>
@@ -9617,7 +9859,7 @@
                 <w:szCs w:val="24"/>
                 <w:rtl w:val="0"/>
               </w:rPr>
-              <w:t xml:space="preserve">Real:</w:t>
+              <w:t xml:space="preserve">Real: 50 hours</w:t>
             </w:r>
           </w:p>
         </w:tc>
@@ -9689,7 +9931,7 @@
                 <w:szCs w:val="24"/>
                 <w:rtl w:val="0"/>
               </w:rPr>
-              <w:t xml:space="preserve">User story analysis and test case generator </w:t>
+              <w:t xml:space="preserve">User story input, MongoDB persistence, test case generator and context retrieval</w:t>
             </w:r>
           </w:p>
         </w:tc>
@@ -9722,7 +9964,7 @@
                 <w:szCs w:val="24"/>
                 <w:rtl w:val="0"/>
               </w:rPr>
-              <w:t xml:space="preserve">Integrate open AI,claud api, process user story</w:t>
+              <w:t xml:space="preserve">Build user story form; Connect frontend and backend API; Create MongoDB schemas; Configure MongoDB Atlas; Connect Vector Database; Implement validation logic; Integrate AI generation workflow</w:t>
             </w:r>
           </w:p>
         </w:tc>
@@ -9757,7 +9999,7 @@
               </w:rPr>
               <w:t xml:space="preserve">Estimated: 60 hours</w:t>
               <w:br w:type="textWrapping"/>
-              <w:t xml:space="preserve">Real:</w:t>
+              <w:t xml:space="preserve">Real: 65 hours</w:t>
             </w:r>
           </w:p>
         </w:tc>
@@ -10002,7 +10244,7 @@
           <w:szCs w:val="24"/>
           <w:rtl w:val="0"/>
         </w:rPr>
-        <w:t xml:space="preserve">Tools</w:t>
+        <w:t xml:space="preserve">Technology Stack</w:t>
       </w:r>
       <w:r>
         <w:rPr>
@@ -10075,31 +10317,7 @@
           <w:szCs w:val="24"/>
           <w:rtl w:val="0"/>
         </w:rPr>
-        <w:t xml:space="preserve">Front end: Javascript, CSS, HTML</w:t>
-      </w:r>
-    </w:p>
-    <w:p>
-      <w:pPr>
-        <w:numPr>
-          <w:ilvl w:val="0"/>
-          <w:numId w:val="9"/>
-        </w:numPr>
-        <w:spacing w:line="276" w:lineRule="auto"/>
-        <w:ind w:left="2160" w:hanging="360"/>
-        <w:rPr>
-          <w:rFonts w:ascii="Times New Roman" w:cs="Times New Roman" w:eastAsia="Times New Roman" w:hAnsi="Times New Roman"/>
-          <w:sz w:val="24"/>
-          <w:szCs w:val="24"/>
-        </w:rPr>
-      </w:pPr>
-      <w:r>
-        <w:rPr>
-          <w:rFonts w:ascii="Times New Roman" w:cs="Times New Roman" w:eastAsia="Times New Roman" w:hAnsi="Times New Roman"/>
-          <w:sz w:val="24"/>
-          <w:szCs w:val="24"/>
-          <w:rtl w:val="0"/>
-        </w:rPr>
-        <w:t xml:space="preserve">Framework: Django </w:t>
+        <w:t xml:space="preserve">Front end: Javascript, Vite, HTML </w:t>
       </w:r>
     </w:p>
     <w:p>
@@ -10860,7 +11078,7 @@
       </w:pPr>
       <w:bookmarkStart w:colFirst="0" w:colLast="0" w:name="_vwjduhc9wuah" w:id="28"/>
       <w:bookmarkEnd w:id="28"/>
-      <w:commentRangeStart w:id="1"/>
+      <w:commentRangeStart w:id="2"/>
       <w:r>
         <w:rPr>
           <w:rFonts w:ascii="Times New Roman" w:cs="Times New Roman" w:eastAsia="Times New Roman" w:hAnsi="Times New Roman"/>
@@ -10872,9 +11090,9 @@
         </w:rPr>
         <w:t xml:space="preserve">Metrics </w:t>
       </w:r>
-      <w:commentRangeEnd w:id="1"/>
-      <w:r>
-        <w:commentReference w:id="1"/>
+      <w:commentRangeEnd w:id="2"/>
+      <w:r>
+        <w:commentReference w:id="2"/>
       </w:r>
       <w:r>
         <w:rPr>
@@ -10906,10 +11124,13 @@
           <w:numId w:val="10"/>
         </w:numPr>
         <w:ind w:left="1440" w:hanging="360"/>
-        <w:rPr/>
-      </w:pPr>
-      <w:r>
-        <w:rPr>
+        <w:rPr>
+          <w:rFonts w:ascii="Times New Roman" w:cs="Times New Roman" w:eastAsia="Times New Roman" w:hAnsi="Times New Roman"/>
+        </w:rPr>
+      </w:pPr>
+      <w:r>
+        <w:rPr>
+          <w:rFonts w:ascii="Times New Roman" w:cs="Times New Roman" w:eastAsia="Times New Roman" w:hAnsi="Times New Roman"/>
           <w:rtl w:val="0"/>
         </w:rPr>
         <w:t xml:space="preserve">Product Metrics: Product metrics evaluate the quality, reliability, and performance of the SpecCheck application itself</w:t>
@@ -10919,7 +11140,9 @@
       <w:pPr>
         <w:widowControl w:val="0"/>
         <w:ind w:left="1440" w:firstLine="0"/>
-        <w:rPr/>
+        <w:rPr>
+          <w:rFonts w:ascii="Times New Roman" w:cs="Times New Roman" w:eastAsia="Times New Roman" w:hAnsi="Times New Roman"/>
+        </w:rPr>
       </w:pPr>
       <w:r>
         <w:rPr>
@@ -10974,10 +11197,13 @@
             <w:pPr>
               <w:widowControl w:val="0"/>
               <w:spacing w:line="240" w:lineRule="auto"/>
-              <w:rPr/>
+              <w:rPr>
+                <w:rFonts w:ascii="Times New Roman" w:cs="Times New Roman" w:eastAsia="Times New Roman" w:hAnsi="Times New Roman"/>
+              </w:rPr>
             </w:pPr>
             <w:r>
               <w:rPr>
+                <w:rFonts w:ascii="Times New Roman" w:cs="Times New Roman" w:eastAsia="Times New Roman" w:hAnsi="Times New Roman"/>
                 <w:rtl w:val="0"/>
               </w:rPr>
               <w:t xml:space="preserve">Metric</w:t>
@@ -10999,10 +11225,13 @@
             <w:pPr>
               <w:widowControl w:val="0"/>
               <w:spacing w:line="240" w:lineRule="auto"/>
-              <w:rPr/>
+              <w:rPr>
+                <w:rFonts w:ascii="Times New Roman" w:cs="Times New Roman" w:eastAsia="Times New Roman" w:hAnsi="Times New Roman"/>
+              </w:rPr>
             </w:pPr>
             <w:r>
               <w:rPr>
+                <w:rFonts w:ascii="Times New Roman" w:cs="Times New Roman" w:eastAsia="Times New Roman" w:hAnsi="Times New Roman"/>
                 <w:rtl w:val="0"/>
               </w:rPr>
               <w:t xml:space="preserve">Description</w:t>
@@ -11030,13 +11259,16 @@
             <w:pPr>
               <w:widowControl w:val="0"/>
               <w:spacing w:line="240" w:lineRule="auto"/>
-              <w:rPr/>
+              <w:rPr>
+                <w:rFonts w:ascii="Times New Roman" w:cs="Times New Roman" w:eastAsia="Times New Roman" w:hAnsi="Times New Roman"/>
+              </w:rPr>
             </w:pPr>
             <w:r>
               <w:rPr>
+                <w:rFonts w:ascii="Times New Roman" w:cs="Times New Roman" w:eastAsia="Times New Roman" w:hAnsi="Times New Roman"/>
                 <w:rtl w:val="0"/>
               </w:rPr>
-              <w:t xml:space="preserve">Total Test Cases</w:t>
+              <w:t xml:space="preserve">User Stories Submitted</w:t>
             </w:r>
           </w:p>
         </w:tc>
@@ -11055,13 +11287,16 @@
             <w:pPr>
               <w:widowControl w:val="0"/>
               <w:spacing w:line="240" w:lineRule="auto"/>
-              <w:rPr/>
+              <w:rPr>
+                <w:rFonts w:ascii="Times New Roman" w:cs="Times New Roman" w:eastAsia="Times New Roman" w:hAnsi="Times New Roman"/>
+              </w:rPr>
             </w:pPr>
             <w:r>
               <w:rPr>
+                <w:rFonts w:ascii="Times New Roman" w:cs="Times New Roman" w:eastAsia="Times New Roman" w:hAnsi="Times New Roman"/>
                 <w:rtl w:val="0"/>
               </w:rPr>
-              <w:t xml:space="preserve">Total number of manual and automated test cases executed</w:t>
+              <w:t xml:space="preserve">Number of user stories processed</w:t>
             </w:r>
           </w:p>
         </w:tc>
@@ -11086,13 +11321,16 @@
             <w:pPr>
               <w:widowControl w:val="0"/>
               <w:spacing w:line="240" w:lineRule="auto"/>
-              <w:rPr/>
+              <w:rPr>
+                <w:rFonts w:ascii="Times New Roman" w:cs="Times New Roman" w:eastAsia="Times New Roman" w:hAnsi="Times New Roman"/>
+              </w:rPr>
             </w:pPr>
             <w:r>
               <w:rPr>
+                <w:rFonts w:ascii="Times New Roman" w:cs="Times New Roman" w:eastAsia="Times New Roman" w:hAnsi="Times New Roman"/>
                 <w:rtl w:val="0"/>
               </w:rPr>
-              <w:t xml:space="preserve">Passed Test Cases</w:t>
+              <w:t xml:space="preserve">Generated Test Cases</w:t>
             </w:r>
           </w:p>
         </w:tc>
@@ -11111,13 +11349,16 @@
             <w:pPr>
               <w:widowControl w:val="0"/>
               <w:spacing w:line="240" w:lineRule="auto"/>
-              <w:rPr/>
+              <w:rPr>
+                <w:rFonts w:ascii="Times New Roman" w:cs="Times New Roman" w:eastAsia="Times New Roman" w:hAnsi="Times New Roman"/>
+              </w:rPr>
             </w:pPr>
             <w:r>
               <w:rPr>
+                <w:rFonts w:ascii="Times New Roman" w:cs="Times New Roman" w:eastAsia="Times New Roman" w:hAnsi="Times New Roman"/>
                 <w:rtl w:val="0"/>
               </w:rPr>
-              <w:t xml:space="preserve">Number of successfully passed test cases</w:t>
+              <w:t xml:space="preserve">Total AI-generated test cases</w:t>
             </w:r>
           </w:p>
         </w:tc>
@@ -11142,13 +11383,16 @@
             <w:pPr>
               <w:widowControl w:val="0"/>
               <w:spacing w:line="240" w:lineRule="auto"/>
-              <w:rPr/>
+              <w:rPr>
+                <w:rFonts w:ascii="Times New Roman" w:cs="Times New Roman" w:eastAsia="Times New Roman" w:hAnsi="Times New Roman"/>
+              </w:rPr>
             </w:pPr>
             <w:r>
               <w:rPr>
+                <w:rFonts w:ascii="Times New Roman" w:cs="Times New Roman" w:eastAsia="Times New Roman" w:hAnsi="Times New Roman"/>
                 <w:rtl w:val="0"/>
               </w:rPr>
-              <w:t xml:space="preserve">Failed Test Cases</w:t>
+              <w:t xml:space="preserve">Context Retrieval Accuracy</w:t>
             </w:r>
           </w:p>
         </w:tc>
@@ -11167,13 +11411,16 @@
             <w:pPr>
               <w:widowControl w:val="0"/>
               <w:spacing w:line="240" w:lineRule="auto"/>
-              <w:rPr/>
+              <w:rPr>
+                <w:rFonts w:ascii="Times New Roman" w:cs="Times New Roman" w:eastAsia="Times New Roman" w:hAnsi="Times New Roman"/>
+              </w:rPr>
             </w:pPr>
             <w:r>
               <w:rPr>
+                <w:rFonts w:ascii="Times New Roman" w:cs="Times New Roman" w:eastAsia="Times New Roman" w:hAnsi="Times New Roman"/>
                 <w:rtl w:val="0"/>
               </w:rPr>
-              <w:t xml:space="preserve">Number of failed test cases</w:t>
+              <w:t xml:space="preserve">Percentage of relevant documents retrieved</w:t>
             </w:r>
           </w:p>
         </w:tc>
@@ -11198,10 +11445,13 @@
             <w:pPr>
               <w:widowControl w:val="0"/>
               <w:spacing w:line="240" w:lineRule="auto"/>
-              <w:rPr/>
+              <w:rPr>
+                <w:rFonts w:ascii="Times New Roman" w:cs="Times New Roman" w:eastAsia="Times New Roman" w:hAnsi="Times New Roman"/>
+              </w:rPr>
             </w:pPr>
             <w:r>
               <w:rPr>
+                <w:rFonts w:ascii="Times New Roman" w:cs="Times New Roman" w:eastAsia="Times New Roman" w:hAnsi="Times New Roman"/>
                 <w:rtl w:val="0"/>
               </w:rPr>
               <w:t xml:space="preserve">Test Coverage</w:t>
@@ -11223,10 +11473,13 @@
             <w:pPr>
               <w:widowControl w:val="0"/>
               <w:spacing w:line="240" w:lineRule="auto"/>
-              <w:rPr/>
+              <w:rPr>
+                <w:rFonts w:ascii="Times New Roman" w:cs="Times New Roman" w:eastAsia="Times New Roman" w:hAnsi="Times New Roman"/>
+              </w:rPr>
             </w:pPr>
             <w:r>
               <w:rPr>
+                <w:rFonts w:ascii="Times New Roman" w:cs="Times New Roman" w:eastAsia="Times New Roman" w:hAnsi="Times New Roman"/>
                 <w:rtl w:val="0"/>
               </w:rPr>
               <w:t xml:space="preserve">Percentage of application features tested</w:t>
@@ -11254,10 +11507,13 @@
             <w:pPr>
               <w:widowControl w:val="0"/>
               <w:spacing w:line="240" w:lineRule="auto"/>
-              <w:rPr/>
+              <w:rPr>
+                <w:rFonts w:ascii="Times New Roman" w:cs="Times New Roman" w:eastAsia="Times New Roman" w:hAnsi="Times New Roman"/>
+              </w:rPr>
             </w:pPr>
             <w:r>
               <w:rPr>
+                <w:rFonts w:ascii="Times New Roman" w:cs="Times New Roman" w:eastAsia="Times New Roman" w:hAnsi="Times New Roman"/>
                 <w:rtl w:val="0"/>
               </w:rPr>
               <w:t xml:space="preserve">Defect Density</w:t>
@@ -11279,10 +11535,13 @@
             <w:pPr>
               <w:widowControl w:val="0"/>
               <w:spacing w:line="240" w:lineRule="auto"/>
-              <w:rPr/>
+              <w:rPr>
+                <w:rFonts w:ascii="Times New Roman" w:cs="Times New Roman" w:eastAsia="Times New Roman" w:hAnsi="Times New Roman"/>
+              </w:rPr>
             </w:pPr>
             <w:r>
               <w:rPr>
+                <w:rFonts w:ascii="Times New Roman" w:cs="Times New Roman" w:eastAsia="Times New Roman" w:hAnsi="Times New Roman"/>
                 <w:rtl w:val="0"/>
               </w:rPr>
               <w:t xml:space="preserve">Number of defects identified per module</w:t>
@@ -11310,10 +11569,13 @@
             <w:pPr>
               <w:widowControl w:val="0"/>
               <w:spacing w:line="240" w:lineRule="auto"/>
-              <w:rPr/>
+              <w:rPr>
+                <w:rFonts w:ascii="Times New Roman" w:cs="Times New Roman" w:eastAsia="Times New Roman" w:hAnsi="Times New Roman"/>
+              </w:rPr>
             </w:pPr>
             <w:r>
               <w:rPr>
+                <w:rFonts w:ascii="Times New Roman" w:cs="Times New Roman" w:eastAsia="Times New Roman" w:hAnsi="Times New Roman"/>
                 <w:rtl w:val="0"/>
               </w:rPr>
               <w:t xml:space="preserve">Authentication Success Rate</w:t>
@@ -11335,10 +11597,13 @@
             <w:pPr>
               <w:widowControl w:val="0"/>
               <w:spacing w:line="240" w:lineRule="auto"/>
-              <w:rPr/>
+              <w:rPr>
+                <w:rFonts w:ascii="Times New Roman" w:cs="Times New Roman" w:eastAsia="Times New Roman" w:hAnsi="Times New Roman"/>
+              </w:rPr>
             </w:pPr>
             <w:r>
               <w:rPr>
+                <w:rFonts w:ascii="Times New Roman" w:cs="Times New Roman" w:eastAsia="Times New Roman" w:hAnsi="Times New Roman"/>
                 <w:rtl w:val="0"/>
               </w:rPr>
               <w:t xml:space="preserve">Successful login/authentication attempts</w:t>
@@ -11366,10 +11631,13 @@
             <w:pPr>
               <w:widowControl w:val="0"/>
               <w:spacing w:line="240" w:lineRule="auto"/>
-              <w:rPr/>
+              <w:rPr>
+                <w:rFonts w:ascii="Times New Roman" w:cs="Times New Roman" w:eastAsia="Times New Roman" w:hAnsi="Times New Roman"/>
+              </w:rPr>
             </w:pPr>
             <w:r>
               <w:rPr>
+                <w:rFonts w:ascii="Times New Roman" w:cs="Times New Roman" w:eastAsia="Times New Roman" w:hAnsi="Times New Roman"/>
                 <w:rtl w:val="0"/>
               </w:rPr>
               <w:t xml:space="preserve">PDF Upload Success Rate</w:t>
@@ -11391,13 +11659,16 @@
             <w:pPr>
               <w:widowControl w:val="0"/>
               <w:spacing w:line="240" w:lineRule="auto"/>
-              <w:rPr/>
+              <w:rPr>
+                <w:rFonts w:ascii="Times New Roman" w:cs="Times New Roman" w:eastAsia="Times New Roman" w:hAnsi="Times New Roman"/>
+              </w:rPr>
             </w:pPr>
             <w:r>
               <w:rPr>
+                <w:rFonts w:ascii="Times New Roman" w:cs="Times New Roman" w:eastAsia="Times New Roman" w:hAnsi="Times New Roman"/>
                 <w:rtl w:val="0"/>
               </w:rPr>
-              <w:t xml:space="preserve">Successful document upload and processing rate</w:t>
+              <w:t xml:space="preserve">Number of indexed documents</w:t>
             </w:r>
           </w:p>
         </w:tc>
@@ -11422,10 +11693,13 @@
             <w:pPr>
               <w:widowControl w:val="0"/>
               <w:spacing w:line="240" w:lineRule="auto"/>
-              <w:rPr/>
+              <w:rPr>
+                <w:rFonts w:ascii="Times New Roman" w:cs="Times New Roman" w:eastAsia="Times New Roman" w:hAnsi="Times New Roman"/>
+              </w:rPr>
             </w:pPr>
             <w:r>
               <w:rPr>
+                <w:rFonts w:ascii="Times New Roman" w:cs="Times New Roman" w:eastAsia="Times New Roman" w:hAnsi="Times New Roman"/>
                 <w:rtl w:val="0"/>
               </w:rPr>
               <w:t xml:space="preserve">AI Test Generation Accuracy</w:t>
@@ -11447,10 +11721,13 @@
             <w:pPr>
               <w:widowControl w:val="0"/>
               <w:spacing w:line="240" w:lineRule="auto"/>
-              <w:rPr/>
+              <w:rPr>
+                <w:rFonts w:ascii="Times New Roman" w:cs="Times New Roman" w:eastAsia="Times New Roman" w:hAnsi="Times New Roman"/>
+              </w:rPr>
             </w:pPr>
             <w:r>
               <w:rPr>
+                <w:rFonts w:ascii="Times New Roman" w:cs="Times New Roman" w:eastAsia="Times New Roman" w:hAnsi="Times New Roman"/>
                 <w:rtl w:val="0"/>
               </w:rPr>
               <w:t xml:space="preserve">Accuracy of generated Gherkin test cases</w:t>
@@ -11478,13 +11755,16 @@
             <w:pPr>
               <w:widowControl w:val="0"/>
               <w:spacing w:line="240" w:lineRule="auto"/>
-              <w:rPr/>
+              <w:rPr>
+                <w:rFonts w:ascii="Times New Roman" w:cs="Times New Roman" w:eastAsia="Times New Roman" w:hAnsi="Times New Roman"/>
+              </w:rPr>
             </w:pPr>
             <w:r>
               <w:rPr>
+                <w:rFonts w:ascii="Times New Roman" w:cs="Times New Roman" w:eastAsia="Times New Roman" w:hAnsi="Times New Roman"/>
                 <w:rtl w:val="0"/>
               </w:rPr>
-              <w:t xml:space="preserve">Export Functionality Success Rate</w:t>
+              <w:t xml:space="preserve">Knowledge Base Size</w:t>
             </w:r>
           </w:p>
         </w:tc>
@@ -11503,10 +11783,13 @@
             <w:pPr>
               <w:widowControl w:val="0"/>
               <w:spacing w:line="240" w:lineRule="auto"/>
-              <w:rPr/>
+              <w:rPr>
+                <w:rFonts w:ascii="Times New Roman" w:cs="Times New Roman" w:eastAsia="Times New Roman" w:hAnsi="Times New Roman"/>
+              </w:rPr>
             </w:pPr>
             <w:r>
               <w:rPr>
+                <w:rFonts w:ascii="Times New Roman" w:cs="Times New Roman" w:eastAsia="Times New Roman" w:hAnsi="Times New Roman"/>
                 <w:rtl w:val="0"/>
               </w:rPr>
               <w:t xml:space="preserve">Successful export operations</w:t>
@@ -11534,10 +11817,13 @@
             <w:pPr>
               <w:widowControl w:val="0"/>
               <w:spacing w:line="240" w:lineRule="auto"/>
-              <w:rPr/>
+              <w:rPr>
+                <w:rFonts w:ascii="Times New Roman" w:cs="Times New Roman" w:eastAsia="Times New Roman" w:hAnsi="Times New Roman"/>
+              </w:rPr>
             </w:pPr>
             <w:r>
               <w:rPr>
+                <w:rFonts w:ascii="Times New Roman" w:cs="Times New Roman" w:eastAsia="Times New Roman" w:hAnsi="Times New Roman"/>
                 <w:rtl w:val="0"/>
               </w:rPr>
               <w:t xml:space="preserve">System Response Time</w:t>
@@ -11559,13 +11845,264 @@
             <w:pPr>
               <w:widowControl w:val="0"/>
               <w:spacing w:line="240" w:lineRule="auto"/>
-              <w:rPr/>
+              <w:rPr>
+                <w:rFonts w:ascii="Times New Roman" w:cs="Times New Roman" w:eastAsia="Times New Roman" w:hAnsi="Times New Roman"/>
+              </w:rPr>
             </w:pPr>
             <w:r>
               <w:rPr>
+                <w:rFonts w:ascii="Times New Roman" w:cs="Times New Roman" w:eastAsia="Times New Roman" w:hAnsi="Times New Roman"/>
                 <w:rtl w:val="0"/>
               </w:rPr>
               <w:t xml:space="preserve">Average response time during AI generation</w:t>
+            </w:r>
+          </w:p>
+        </w:tc>
+      </w:tr>
+      <w:tr>
+        <w:trPr>
+          <w:cantSplit w:val="0"/>
+          <w:tblHeader w:val="0"/>
+        </w:trPr>
+        <w:tc>
+          <w:tcPr>
+            <w:shd w:fill="auto" w:val="clear"/>
+            <w:tcMar>
+              <w:top w:w="100.0" w:type="dxa"/>
+              <w:left w:w="100.0" w:type="dxa"/>
+              <w:bottom w:w="100.0" w:type="dxa"/>
+              <w:right w:w="100.0" w:type="dxa"/>
+            </w:tcMar>
+            <w:vAlign w:val="top"/>
+          </w:tcPr>
+          <w:p>
+            <w:pPr>
+              <w:widowControl w:val="0"/>
+              <w:spacing w:line="240" w:lineRule="auto"/>
+              <w:rPr>
+                <w:rFonts w:ascii="Times New Roman" w:cs="Times New Roman" w:eastAsia="Times New Roman" w:hAnsi="Times New Roman"/>
+              </w:rPr>
+            </w:pPr>
+            <w:r>
+              <w:rPr>
+                <w:rFonts w:ascii="Times New Roman" w:cs="Times New Roman" w:eastAsia="Times New Roman" w:hAnsi="Times New Roman"/>
+                <w:rtl w:val="0"/>
+              </w:rPr>
+              <w:t xml:space="preserve">Index Chunks</w:t>
+            </w:r>
+          </w:p>
+        </w:tc>
+        <w:tc>
+          <w:tcPr>
+            <w:shd w:fill="auto" w:val="clear"/>
+            <w:tcMar>
+              <w:top w:w="100.0" w:type="dxa"/>
+              <w:left w:w="100.0" w:type="dxa"/>
+              <w:bottom w:w="100.0" w:type="dxa"/>
+              <w:right w:w="100.0" w:type="dxa"/>
+            </w:tcMar>
+            <w:vAlign w:val="top"/>
+          </w:tcPr>
+          <w:p>
+            <w:pPr>
+              <w:widowControl w:val="0"/>
+              <w:spacing w:line="240" w:lineRule="auto"/>
+              <w:rPr>
+                <w:rFonts w:ascii="Times New Roman" w:cs="Times New Roman" w:eastAsia="Times New Roman" w:hAnsi="Times New Roman"/>
+              </w:rPr>
+            </w:pPr>
+            <w:r>
+              <w:rPr>
+                <w:rFonts w:ascii="Times New Roman" w:cs="Times New Roman" w:eastAsia="Times New Roman" w:hAnsi="Times New Roman"/>
+                <w:rtl w:val="0"/>
+              </w:rPr>
+              <w:t xml:space="preserve">Number of vector embeddings stored</w:t>
+            </w:r>
+          </w:p>
+        </w:tc>
+      </w:tr>
+      <w:tr>
+        <w:trPr>
+          <w:cantSplit w:val="0"/>
+          <w:tblHeader w:val="0"/>
+        </w:trPr>
+        <w:tc>
+          <w:tcPr>
+            <w:shd w:fill="auto" w:val="clear"/>
+            <w:tcMar>
+              <w:top w:w="100.0" w:type="dxa"/>
+              <w:left w:w="100.0" w:type="dxa"/>
+              <w:bottom w:w="100.0" w:type="dxa"/>
+              <w:right w:w="100.0" w:type="dxa"/>
+            </w:tcMar>
+            <w:vAlign w:val="top"/>
+          </w:tcPr>
+          <w:p>
+            <w:pPr>
+              <w:widowControl w:val="0"/>
+              <w:spacing w:line="240" w:lineRule="auto"/>
+              <w:rPr>
+                <w:rFonts w:ascii="Times New Roman" w:cs="Times New Roman" w:eastAsia="Times New Roman" w:hAnsi="Times New Roman"/>
+              </w:rPr>
+            </w:pPr>
+            <w:r>
+              <w:rPr>
+                <w:rFonts w:ascii="Times New Roman" w:cs="Times New Roman" w:eastAsia="Times New Roman" w:hAnsi="Times New Roman"/>
+                <w:rtl w:val="0"/>
+              </w:rPr>
+              <w:t xml:space="preserve">MongoDB Persistence Success Rate</w:t>
+            </w:r>
+          </w:p>
+        </w:tc>
+        <w:tc>
+          <w:tcPr>
+            <w:shd w:fill="auto" w:val="clear"/>
+            <w:tcMar>
+              <w:top w:w="100.0" w:type="dxa"/>
+              <w:left w:w="100.0" w:type="dxa"/>
+              <w:bottom w:w="100.0" w:type="dxa"/>
+              <w:right w:w="100.0" w:type="dxa"/>
+            </w:tcMar>
+            <w:vAlign w:val="top"/>
+          </w:tcPr>
+          <w:p>
+            <w:pPr>
+              <w:widowControl w:val="0"/>
+              <w:spacing w:line="240" w:lineRule="auto"/>
+              <w:rPr>
+                <w:rFonts w:ascii="Times New Roman" w:cs="Times New Roman" w:eastAsia="Times New Roman" w:hAnsi="Times New Roman"/>
+              </w:rPr>
+            </w:pPr>
+            <w:r>
+              <w:rPr>
+                <w:rFonts w:ascii="Times New Roman" w:cs="Times New Roman" w:eastAsia="Times New Roman" w:hAnsi="Times New Roman"/>
+                <w:rtl w:val="0"/>
+              </w:rPr>
+              <w:t xml:space="preserve">Successful database save operations</w:t>
+            </w:r>
+          </w:p>
+        </w:tc>
+      </w:tr>
+      <w:tr>
+        <w:trPr>
+          <w:cantSplit w:val="0"/>
+          <w:tblHeader w:val="0"/>
+        </w:trPr>
+        <w:tc>
+          <w:tcPr>
+            <w:shd w:fill="auto" w:val="clear"/>
+            <w:tcMar>
+              <w:top w:w="100.0" w:type="dxa"/>
+              <w:left w:w="100.0" w:type="dxa"/>
+              <w:bottom w:w="100.0" w:type="dxa"/>
+              <w:right w:w="100.0" w:type="dxa"/>
+            </w:tcMar>
+            <w:vAlign w:val="top"/>
+          </w:tcPr>
+          <w:p>
+            <w:pPr>
+              <w:widowControl w:val="0"/>
+              <w:spacing w:line="240" w:lineRule="auto"/>
+              <w:rPr>
+                <w:rFonts w:ascii="Times New Roman" w:cs="Times New Roman" w:eastAsia="Times New Roman" w:hAnsi="Times New Roman"/>
+              </w:rPr>
+            </w:pPr>
+            <w:r>
+              <w:rPr>
+                <w:rFonts w:ascii="Times New Roman" w:cs="Times New Roman" w:eastAsia="Times New Roman" w:hAnsi="Times New Roman"/>
+                <w:rtl w:val="0"/>
+              </w:rPr>
+              <w:t xml:space="preserve">AI Generation Success Rate</w:t>
+            </w:r>
+          </w:p>
+        </w:tc>
+        <w:tc>
+          <w:tcPr>
+            <w:shd w:fill="auto" w:val="clear"/>
+            <w:tcMar>
+              <w:top w:w="100.0" w:type="dxa"/>
+              <w:left w:w="100.0" w:type="dxa"/>
+              <w:bottom w:w="100.0" w:type="dxa"/>
+              <w:right w:w="100.0" w:type="dxa"/>
+            </w:tcMar>
+            <w:vAlign w:val="top"/>
+          </w:tcPr>
+          <w:p>
+            <w:pPr>
+              <w:widowControl w:val="0"/>
+              <w:spacing w:line="240" w:lineRule="auto"/>
+              <w:rPr>
+                <w:rFonts w:ascii="Times New Roman" w:cs="Times New Roman" w:eastAsia="Times New Roman" w:hAnsi="Times New Roman"/>
+              </w:rPr>
+            </w:pPr>
+            <w:r>
+              <w:rPr>
+                <w:rFonts w:ascii="Times New Roman" w:cs="Times New Roman" w:eastAsia="Times New Roman" w:hAnsi="Times New Roman"/>
+                <w:rtl w:val="0"/>
+              </w:rPr>
+              <w:t xml:space="preserve">Successful generations without errors</w:t>
+            </w:r>
+          </w:p>
+        </w:tc>
+      </w:tr>
+      <w:tr>
+        <w:trPr>
+          <w:cantSplit w:val="0"/>
+          <w:tblHeader w:val="0"/>
+        </w:trPr>
+        <w:tc>
+          <w:tcPr>
+            <w:shd w:fill="auto" w:val="clear"/>
+            <w:tcMar>
+              <w:top w:w="100.0" w:type="dxa"/>
+              <w:left w:w="100.0" w:type="dxa"/>
+              <w:bottom w:w="100.0" w:type="dxa"/>
+              <w:right w:w="100.0" w:type="dxa"/>
+            </w:tcMar>
+            <w:vAlign w:val="top"/>
+          </w:tcPr>
+          <w:p>
+            <w:pPr>
+              <w:widowControl w:val="0"/>
+              <w:spacing w:line="240" w:lineRule="auto"/>
+              <w:rPr>
+                <w:rFonts w:ascii="Times New Roman" w:cs="Times New Roman" w:eastAsia="Times New Roman" w:hAnsi="Times New Roman"/>
+              </w:rPr>
+            </w:pPr>
+            <w:r>
+              <w:rPr>
+                <w:rFonts w:ascii="Times New Roman" w:cs="Times New Roman" w:eastAsia="Times New Roman" w:hAnsi="Times New Roman"/>
+                <w:rtl w:val="0"/>
+              </w:rPr>
+              <w:t xml:space="preserve">Average Generation Time</w:t>
+            </w:r>
+          </w:p>
+        </w:tc>
+        <w:tc>
+          <w:tcPr>
+            <w:shd w:fill="auto" w:val="clear"/>
+            <w:tcMar>
+              <w:top w:w="100.0" w:type="dxa"/>
+              <w:left w:w="100.0" w:type="dxa"/>
+              <w:bottom w:w="100.0" w:type="dxa"/>
+              <w:right w:w="100.0" w:type="dxa"/>
+            </w:tcMar>
+            <w:vAlign w:val="top"/>
+          </w:tcPr>
+          <w:p>
+            <w:pPr>
+              <w:widowControl w:val="0"/>
+              <w:spacing w:line="240" w:lineRule="auto"/>
+              <w:rPr>
+                <w:rFonts w:ascii="Times New Roman" w:cs="Times New Roman" w:eastAsia="Times New Roman" w:hAnsi="Times New Roman"/>
+              </w:rPr>
+            </w:pPr>
+            <w:r>
+              <w:rPr>
+                <w:rFonts w:ascii="Times New Roman" w:cs="Times New Roman" w:eastAsia="Times New Roman" w:hAnsi="Times New Roman"/>
+                <w:rtl w:val="0"/>
+              </w:rPr>
+              <w:t xml:space="preserve">Average time to generate test cases</w:t>
             </w:r>
           </w:p>
         </w:tc>
@@ -11603,10 +12140,13 @@
           <w:numId w:val="10"/>
         </w:numPr>
         <w:ind w:left="1440" w:hanging="360"/>
-        <w:rPr/>
-      </w:pPr>
-      <w:r>
-        <w:rPr>
+        <w:rPr>
+          <w:rFonts w:ascii="Times New Roman" w:cs="Times New Roman" w:eastAsia="Times New Roman" w:hAnsi="Times New Roman"/>
+        </w:rPr>
+      </w:pPr>
+      <w:r>
+        <w:rPr>
+          <w:rFonts w:ascii="Times New Roman" w:cs="Times New Roman" w:eastAsia="Times New Roman" w:hAnsi="Times New Roman"/>
           <w:rtl w:val="0"/>
         </w:rPr>
         <w:t xml:space="preserve">Process Metrics: evaluate the effectiveness and efficiency of the software development and testing process.</w:t>
@@ -11616,7 +12156,9 @@
       <w:pPr>
         <w:widowControl w:val="0"/>
         <w:ind w:left="0" w:firstLine="0"/>
-        <w:rPr/>
+        <w:rPr>
+          <w:rFonts w:ascii="Times New Roman" w:cs="Times New Roman" w:eastAsia="Times New Roman" w:hAnsi="Times New Roman"/>
+        </w:rPr>
       </w:pPr>
       <w:r>
         <w:rPr>
@@ -11671,10 +12213,13 @@
             <w:pPr>
               <w:widowControl w:val="0"/>
               <w:spacing w:line="240" w:lineRule="auto"/>
-              <w:rPr/>
+              <w:rPr>
+                <w:rFonts w:ascii="Times New Roman" w:cs="Times New Roman" w:eastAsia="Times New Roman" w:hAnsi="Times New Roman"/>
+              </w:rPr>
             </w:pPr>
             <w:r>
               <w:rPr>
+                <w:rFonts w:ascii="Times New Roman" w:cs="Times New Roman" w:eastAsia="Times New Roman" w:hAnsi="Times New Roman"/>
                 <w:rtl w:val="0"/>
               </w:rPr>
               <w:t xml:space="preserve">Metric</w:t>
@@ -11696,10 +12241,13 @@
             <w:pPr>
               <w:widowControl w:val="0"/>
               <w:spacing w:line="240" w:lineRule="auto"/>
-              <w:rPr/>
+              <w:rPr>
+                <w:rFonts w:ascii="Times New Roman" w:cs="Times New Roman" w:eastAsia="Times New Roman" w:hAnsi="Times New Roman"/>
+              </w:rPr>
             </w:pPr>
             <w:r>
               <w:rPr>
+                <w:rFonts w:ascii="Times New Roman" w:cs="Times New Roman" w:eastAsia="Times New Roman" w:hAnsi="Times New Roman"/>
                 <w:rtl w:val="0"/>
               </w:rPr>
               <w:t xml:space="preserve">Description</w:t>
@@ -11727,13 +12275,16 @@
             <w:pPr>
               <w:widowControl w:val="0"/>
               <w:spacing w:line="240" w:lineRule="auto"/>
-              <w:rPr/>
+              <w:rPr>
+                <w:rFonts w:ascii="Times New Roman" w:cs="Times New Roman" w:eastAsia="Times New Roman" w:hAnsi="Times New Roman"/>
+              </w:rPr>
             </w:pPr>
             <w:r>
               <w:rPr>
+                <w:rFonts w:ascii="Times New Roman" w:cs="Times New Roman" w:eastAsia="Times New Roman" w:hAnsi="Times New Roman"/>
                 <w:rtl w:val="0"/>
               </w:rPr>
-              <w:t xml:space="preserve">Number of Iterations Completed</w:t>
+              <w:t xml:space="preserve">Number of Iterations Completed </w:t>
             </w:r>
           </w:p>
         </w:tc>
@@ -11752,10 +12303,13 @@
             <w:pPr>
               <w:widowControl w:val="0"/>
               <w:spacing w:line="240" w:lineRule="auto"/>
-              <w:rPr/>
+              <w:rPr>
+                <w:rFonts w:ascii="Times New Roman" w:cs="Times New Roman" w:eastAsia="Times New Roman" w:hAnsi="Times New Roman"/>
+              </w:rPr>
             </w:pPr>
             <w:r>
               <w:rPr>
+                <w:rFonts w:ascii="Times New Roman" w:cs="Times New Roman" w:eastAsia="Times New Roman" w:hAnsi="Times New Roman"/>
                 <w:rtl w:val="0"/>
               </w:rPr>
               <w:t xml:space="preserve">Agile development iterations completed</w:t>
@@ -11783,10 +12337,13 @@
             <w:pPr>
               <w:widowControl w:val="0"/>
               <w:spacing w:line="240" w:lineRule="auto"/>
-              <w:rPr/>
+              <w:rPr>
+                <w:rFonts w:ascii="Times New Roman" w:cs="Times New Roman" w:eastAsia="Times New Roman" w:hAnsi="Times New Roman"/>
+              </w:rPr>
             </w:pPr>
             <w:r>
               <w:rPr>
+                <w:rFonts w:ascii="Times New Roman" w:cs="Times New Roman" w:eastAsia="Times New Roman" w:hAnsi="Times New Roman"/>
                 <w:rtl w:val="0"/>
               </w:rPr>
               <w:t xml:space="preserve">Bugs Resolved per Iteration</w:t>
@@ -11808,10 +12365,13 @@
             <w:pPr>
               <w:widowControl w:val="0"/>
               <w:spacing w:line="240" w:lineRule="auto"/>
-              <w:rPr/>
+              <w:rPr>
+                <w:rFonts w:ascii="Times New Roman" w:cs="Times New Roman" w:eastAsia="Times New Roman" w:hAnsi="Times New Roman"/>
+              </w:rPr>
             </w:pPr>
             <w:r>
               <w:rPr>
+                <w:rFonts w:ascii="Times New Roman" w:cs="Times New Roman" w:eastAsia="Times New Roman" w:hAnsi="Times New Roman"/>
                 <w:rtl w:val="0"/>
               </w:rPr>
               <w:t xml:space="preserve">Average defects fixed during each iteration</w:t>
@@ -11839,10 +12399,13 @@
             <w:pPr>
               <w:widowControl w:val="0"/>
               <w:spacing w:line="240" w:lineRule="auto"/>
-              <w:rPr/>
+              <w:rPr>
+                <w:rFonts w:ascii="Times New Roman" w:cs="Times New Roman" w:eastAsia="Times New Roman" w:hAnsi="Times New Roman"/>
+              </w:rPr>
             </w:pPr>
             <w:r>
               <w:rPr>
+                <w:rFonts w:ascii="Times New Roman" w:cs="Times New Roman" w:eastAsia="Times New Roman" w:hAnsi="Times New Roman"/>
                 <w:rtl w:val="0"/>
               </w:rPr>
               <w:t xml:space="preserve">GitHub Commits</w:t>
@@ -11864,10 +12427,13 @@
             <w:pPr>
               <w:widowControl w:val="0"/>
               <w:spacing w:line="240" w:lineRule="auto"/>
-              <w:rPr/>
+              <w:rPr>
+                <w:rFonts w:ascii="Times New Roman" w:cs="Times New Roman" w:eastAsia="Times New Roman" w:hAnsi="Times New Roman"/>
+              </w:rPr>
             </w:pPr>
             <w:r>
               <w:rPr>
+                <w:rFonts w:ascii="Times New Roman" w:cs="Times New Roman" w:eastAsia="Times New Roman" w:hAnsi="Times New Roman"/>
                 <w:rtl w:val="0"/>
               </w:rPr>
               <w:t xml:space="preserve">Total code commits contributed by team</w:t>
@@ -11895,10 +12461,13 @@
             <w:pPr>
               <w:widowControl w:val="0"/>
               <w:spacing w:line="240" w:lineRule="auto"/>
-              <w:rPr/>
+              <w:rPr>
+                <w:rFonts w:ascii="Times New Roman" w:cs="Times New Roman" w:eastAsia="Times New Roman" w:hAnsi="Times New Roman"/>
+              </w:rPr>
             </w:pPr>
             <w:r>
               <w:rPr>
+                <w:rFonts w:ascii="Times New Roman" w:cs="Times New Roman" w:eastAsia="Times New Roman" w:hAnsi="Times New Roman"/>
                 <w:rtl w:val="0"/>
               </w:rPr>
               <w:t xml:space="preserve">Pull Requests Reviewed</w:t>
@@ -11920,10 +12489,13 @@
             <w:pPr>
               <w:widowControl w:val="0"/>
               <w:spacing w:line="240" w:lineRule="auto"/>
-              <w:rPr/>
+              <w:rPr>
+                <w:rFonts w:ascii="Times New Roman" w:cs="Times New Roman" w:eastAsia="Times New Roman" w:hAnsi="Times New Roman"/>
+              </w:rPr>
             </w:pPr>
             <w:r>
               <w:rPr>
+                <w:rFonts w:ascii="Times New Roman" w:cs="Times New Roman" w:eastAsia="Times New Roman" w:hAnsi="Times New Roman"/>
                 <w:rtl w:val="0"/>
               </w:rPr>
               <w:t xml:space="preserve">Number of reviewed pull requests</w:t>
@@ -11951,10 +12523,13 @@
             <w:pPr>
               <w:widowControl w:val="0"/>
               <w:spacing w:line="240" w:lineRule="auto"/>
-              <w:rPr/>
+              <w:rPr>
+                <w:rFonts w:ascii="Times New Roman" w:cs="Times New Roman" w:eastAsia="Times New Roman" w:hAnsi="Times New Roman"/>
+              </w:rPr>
             </w:pPr>
             <w:r>
               <w:rPr>
+                <w:rFonts w:ascii="Times New Roman" w:cs="Times New Roman" w:eastAsia="Times New Roman" w:hAnsi="Times New Roman"/>
                 <w:rtl w:val="0"/>
               </w:rPr>
               <w:t xml:space="preserve">Automated Build Success Rate</w:t>
@@ -11976,10 +12551,13 @@
             <w:pPr>
               <w:widowControl w:val="0"/>
               <w:spacing w:line="240" w:lineRule="auto"/>
-              <w:rPr/>
+              <w:rPr>
+                <w:rFonts w:ascii="Times New Roman" w:cs="Times New Roman" w:eastAsia="Times New Roman" w:hAnsi="Times New Roman"/>
+              </w:rPr>
             </w:pPr>
             <w:r>
               <w:rPr>
+                <w:rFonts w:ascii="Times New Roman" w:cs="Times New Roman" w:eastAsia="Times New Roman" w:hAnsi="Times New Roman"/>
                 <w:rtl w:val="0"/>
               </w:rPr>
               <w:t xml:space="preserve">Successful CI/CD pipeline executions</w:t>
@@ -12007,10 +12585,13 @@
             <w:pPr>
               <w:widowControl w:val="0"/>
               <w:spacing w:line="240" w:lineRule="auto"/>
-              <w:rPr/>
+              <w:rPr>
+                <w:rFonts w:ascii="Times New Roman" w:cs="Times New Roman" w:eastAsia="Times New Roman" w:hAnsi="Times New Roman"/>
+              </w:rPr>
             </w:pPr>
             <w:r>
               <w:rPr>
+                <w:rFonts w:ascii="Times New Roman" w:cs="Times New Roman" w:eastAsia="Times New Roman" w:hAnsi="Times New Roman"/>
                 <w:rtl w:val="0"/>
               </w:rPr>
               <w:t xml:space="preserve">Team Meeting Frequency</w:t>
@@ -12032,10 +12613,13 @@
             <w:pPr>
               <w:widowControl w:val="0"/>
               <w:spacing w:line="240" w:lineRule="auto"/>
-              <w:rPr/>
+              <w:rPr>
+                <w:rFonts w:ascii="Times New Roman" w:cs="Times New Roman" w:eastAsia="Times New Roman" w:hAnsi="Times New Roman"/>
+              </w:rPr>
             </w:pPr>
             <w:r>
               <w:rPr>
+                <w:rFonts w:ascii="Times New Roman" w:cs="Times New Roman" w:eastAsia="Times New Roman" w:hAnsi="Times New Roman"/>
                 <w:rtl w:val="0"/>
               </w:rPr>
               <w:t xml:space="preserve">Scrum/project meetings conducted weekly</w:t>
@@ -12063,10 +12647,13 @@
             <w:pPr>
               <w:widowControl w:val="0"/>
               <w:spacing w:line="240" w:lineRule="auto"/>
-              <w:rPr/>
+              <w:rPr>
+                <w:rFonts w:ascii="Times New Roman" w:cs="Times New Roman" w:eastAsia="Times New Roman" w:hAnsi="Times New Roman"/>
+              </w:rPr>
             </w:pPr>
             <w:r>
               <w:rPr>
+                <w:rFonts w:ascii="Times New Roman" w:cs="Times New Roman" w:eastAsia="Times New Roman" w:hAnsi="Times New Roman"/>
                 <w:rtl w:val="0"/>
               </w:rPr>
               <w:t xml:space="preserve">Average Bug Resolution Time</w:t>
@@ -12088,10 +12675,13 @@
             <w:pPr>
               <w:widowControl w:val="0"/>
               <w:spacing w:line="240" w:lineRule="auto"/>
-              <w:rPr/>
+              <w:rPr>
+                <w:rFonts w:ascii="Times New Roman" w:cs="Times New Roman" w:eastAsia="Times New Roman" w:hAnsi="Times New Roman"/>
+              </w:rPr>
             </w:pPr>
             <w:r>
               <w:rPr>
+                <w:rFonts w:ascii="Times New Roman" w:cs="Times New Roman" w:eastAsia="Times New Roman" w:hAnsi="Times New Roman"/>
                 <w:rtl w:val="0"/>
               </w:rPr>
               <w:t xml:space="preserve">Average time to fix reported issues</w:t>
@@ -12119,10 +12709,13 @@
             <w:pPr>
               <w:widowControl w:val="0"/>
               <w:spacing w:line="240" w:lineRule="auto"/>
-              <w:rPr/>
+              <w:rPr>
+                <w:rFonts w:ascii="Times New Roman" w:cs="Times New Roman" w:eastAsia="Times New Roman" w:hAnsi="Times New Roman"/>
+              </w:rPr>
             </w:pPr>
             <w:r>
               <w:rPr>
+                <w:rFonts w:ascii="Times New Roman" w:cs="Times New Roman" w:eastAsia="Times New Roman" w:hAnsi="Times New Roman"/>
                 <w:rtl w:val="0"/>
               </w:rPr>
               <w:t xml:space="preserve">Requirement Completion Rate</w:t>
@@ -12144,10 +12737,13 @@
             <w:pPr>
               <w:widowControl w:val="0"/>
               <w:spacing w:line="240" w:lineRule="auto"/>
-              <w:rPr/>
+              <w:rPr>
+                <w:rFonts w:ascii="Times New Roman" w:cs="Times New Roman" w:eastAsia="Times New Roman" w:hAnsi="Times New Roman"/>
+              </w:rPr>
             </w:pPr>
             <w:r>
               <w:rPr>
+                <w:rFonts w:ascii="Times New Roman" w:cs="Times New Roman" w:eastAsia="Times New Roman" w:hAnsi="Times New Roman"/>
                 <w:rtl w:val="0"/>
               </w:rPr>
               <w:t xml:space="preserve">Percentage of planned requirements completed</w:t>
@@ -12175,10 +12771,13 @@
             <w:pPr>
               <w:widowControl w:val="0"/>
               <w:spacing w:line="240" w:lineRule="auto"/>
-              <w:rPr/>
+              <w:rPr>
+                <w:rFonts w:ascii="Times New Roman" w:cs="Times New Roman" w:eastAsia="Times New Roman" w:hAnsi="Times New Roman"/>
+              </w:rPr>
             </w:pPr>
             <w:r>
               <w:rPr>
+                <w:rFonts w:ascii="Times New Roman" w:cs="Times New Roman" w:eastAsia="Times New Roman" w:hAnsi="Times New Roman"/>
                 <w:rtl w:val="0"/>
               </w:rPr>
               <w:t xml:space="preserve">Documentation Update Frequency</w:t>
@@ -12200,10 +12799,13 @@
             <w:pPr>
               <w:widowControl w:val="0"/>
               <w:spacing w:line="240" w:lineRule="auto"/>
-              <w:rPr/>
+              <w:rPr>
+                <w:rFonts w:ascii="Times New Roman" w:cs="Times New Roman" w:eastAsia="Times New Roman" w:hAnsi="Times New Roman"/>
+              </w:rPr>
             </w:pPr>
             <w:r>
               <w:rPr>
+                <w:rFonts w:ascii="Times New Roman" w:cs="Times New Roman" w:eastAsia="Times New Roman" w:hAnsi="Times New Roman"/>
                 <w:rtl w:val="0"/>
               </w:rPr>
               <w:t xml:space="preserve">Frequency of SPPP/SDD/Test document updates</w:t>
@@ -12231,10 +12833,13 @@
             <w:pPr>
               <w:widowControl w:val="0"/>
               <w:spacing w:line="240" w:lineRule="auto"/>
-              <w:rPr/>
+              <w:rPr>
+                <w:rFonts w:ascii="Times New Roman" w:cs="Times New Roman" w:eastAsia="Times New Roman" w:hAnsi="Times New Roman"/>
+              </w:rPr>
             </w:pPr>
             <w:r>
               <w:rPr>
+                <w:rFonts w:ascii="Times New Roman" w:cs="Times New Roman" w:eastAsia="Times New Roman" w:hAnsi="Times New Roman"/>
                 <w:rtl w:val="0"/>
               </w:rPr>
               <w:t xml:space="preserve">AI-Assisted Development Usage</w:t>
@@ -12256,13 +12861,202 @@
             <w:pPr>
               <w:widowControl w:val="0"/>
               <w:spacing w:line="240" w:lineRule="auto"/>
-              <w:rPr/>
+              <w:rPr>
+                <w:rFonts w:ascii="Times New Roman" w:cs="Times New Roman" w:eastAsia="Times New Roman" w:hAnsi="Times New Roman"/>
+              </w:rPr>
             </w:pPr>
             <w:r>
               <w:rPr>
+                <w:rFonts w:ascii="Times New Roman" w:cs="Times New Roman" w:eastAsia="Times New Roman" w:hAnsi="Times New Roman"/>
                 <w:rtl w:val="0"/>
               </w:rPr>
               <w:t xml:space="preserve">Percentage of AI-assisted documentation/coding support</w:t>
+            </w:r>
+          </w:p>
+        </w:tc>
+      </w:tr>
+      <w:tr>
+        <w:trPr>
+          <w:cantSplit w:val="0"/>
+          <w:tblHeader w:val="0"/>
+        </w:trPr>
+        <w:tc>
+          <w:tcPr>
+            <w:shd w:fill="auto" w:val="clear"/>
+            <w:tcMar>
+              <w:top w:w="100.0" w:type="dxa"/>
+              <w:left w:w="100.0" w:type="dxa"/>
+              <w:bottom w:w="100.0" w:type="dxa"/>
+              <w:right w:w="100.0" w:type="dxa"/>
+            </w:tcMar>
+            <w:vAlign w:val="top"/>
+          </w:tcPr>
+          <w:p>
+            <w:pPr>
+              <w:widowControl w:val="0"/>
+              <w:spacing w:line="240" w:lineRule="auto"/>
+              <w:rPr>
+                <w:rFonts w:ascii="Times New Roman" w:cs="Times New Roman" w:eastAsia="Times New Roman" w:hAnsi="Times New Roman"/>
+              </w:rPr>
+            </w:pPr>
+            <w:r>
+              <w:rPr>
+                <w:rFonts w:ascii="Times New Roman" w:cs="Times New Roman" w:eastAsia="Times New Roman" w:hAnsi="Times New Roman"/>
+                <w:rtl w:val="0"/>
+              </w:rPr>
+              <w:t xml:space="preserve">User Stories Completed</w:t>
+            </w:r>
+          </w:p>
+        </w:tc>
+        <w:tc>
+          <w:tcPr>
+            <w:shd w:fill="auto" w:val="clear"/>
+            <w:tcMar>
+              <w:top w:w="100.0" w:type="dxa"/>
+              <w:left w:w="100.0" w:type="dxa"/>
+              <w:bottom w:w="100.0" w:type="dxa"/>
+              <w:right w:w="100.0" w:type="dxa"/>
+            </w:tcMar>
+            <w:vAlign w:val="top"/>
+          </w:tcPr>
+          <w:p>
+            <w:pPr>
+              <w:widowControl w:val="0"/>
+              <w:spacing w:line="240" w:lineRule="auto"/>
+              <w:rPr>
+                <w:rFonts w:ascii="Times New Roman" w:cs="Times New Roman" w:eastAsia="Times New Roman" w:hAnsi="Times New Roman"/>
+              </w:rPr>
+            </w:pPr>
+            <w:r>
+              <w:rPr>
+                <w:rFonts w:ascii="Times New Roman" w:cs="Times New Roman" w:eastAsia="Times New Roman" w:hAnsi="Times New Roman"/>
+                <w:rtl w:val="0"/>
+              </w:rPr>
+              <w:t xml:space="preserve">Measures completed Jira user stories</w:t>
+            </w:r>
+          </w:p>
+        </w:tc>
+      </w:tr>
+      <w:tr>
+        <w:trPr>
+          <w:cantSplit w:val="0"/>
+          <w:tblHeader w:val="0"/>
+        </w:trPr>
+        <w:tc>
+          <w:tcPr>
+            <w:shd w:fill="auto" w:val="clear"/>
+            <w:tcMar>
+              <w:top w:w="100.0" w:type="dxa"/>
+              <w:left w:w="100.0" w:type="dxa"/>
+              <w:bottom w:w="100.0" w:type="dxa"/>
+              <w:right w:w="100.0" w:type="dxa"/>
+            </w:tcMar>
+            <w:vAlign w:val="top"/>
+          </w:tcPr>
+          <w:p>
+            <w:pPr>
+              <w:widowControl w:val="0"/>
+              <w:spacing w:line="240" w:lineRule="auto"/>
+              <w:rPr>
+                <w:rFonts w:ascii="Times New Roman" w:cs="Times New Roman" w:eastAsia="Times New Roman" w:hAnsi="Times New Roman"/>
+              </w:rPr>
+            </w:pPr>
+            <w:r>
+              <w:rPr>
+                <w:rFonts w:ascii="Times New Roman" w:cs="Times New Roman" w:eastAsia="Times New Roman" w:hAnsi="Times New Roman"/>
+                <w:rtl w:val="0"/>
+              </w:rPr>
+              <w:t xml:space="preserve">Story Points Completed</w:t>
+            </w:r>
+          </w:p>
+        </w:tc>
+        <w:tc>
+          <w:tcPr>
+            <w:shd w:fill="auto" w:val="clear"/>
+            <w:tcMar>
+              <w:top w:w="100.0" w:type="dxa"/>
+              <w:left w:w="100.0" w:type="dxa"/>
+              <w:bottom w:w="100.0" w:type="dxa"/>
+              <w:right w:w="100.0" w:type="dxa"/>
+            </w:tcMar>
+            <w:vAlign w:val="top"/>
+          </w:tcPr>
+          <w:p>
+            <w:pPr>
+              <w:widowControl w:val="0"/>
+              <w:spacing w:line="240" w:lineRule="auto"/>
+              <w:rPr>
+                <w:rFonts w:ascii="Times New Roman" w:cs="Times New Roman" w:eastAsia="Times New Roman" w:hAnsi="Times New Roman"/>
+              </w:rPr>
+            </w:pPr>
+            <w:r>
+              <w:rPr>
+                <w:rFonts w:ascii="Times New Roman" w:cs="Times New Roman" w:eastAsia="Times New Roman" w:hAnsi="Times New Roman"/>
+                <w:rtl w:val="0"/>
+              </w:rPr>
+              <w:t xml:space="preserve">Measures completed Agile effort</w:t>
+            </w:r>
+          </w:p>
+        </w:tc>
+      </w:tr>
+      <w:tr>
+        <w:trPr>
+          <w:cantSplit w:val="0"/>
+          <w:tblHeader w:val="0"/>
+        </w:trPr>
+        <w:tc>
+          <w:tcPr>
+            <w:shd w:fill="auto" w:val="clear"/>
+            <w:tcMar>
+              <w:top w:w="100.0" w:type="dxa"/>
+              <w:left w:w="100.0" w:type="dxa"/>
+              <w:bottom w:w="100.0" w:type="dxa"/>
+              <w:right w:w="100.0" w:type="dxa"/>
+            </w:tcMar>
+            <w:vAlign w:val="top"/>
+          </w:tcPr>
+          <w:p>
+            <w:pPr>
+              <w:widowControl w:val="0"/>
+              <w:spacing w:line="240" w:lineRule="auto"/>
+              <w:rPr>
+                <w:rFonts w:ascii="Times New Roman" w:cs="Times New Roman" w:eastAsia="Times New Roman" w:hAnsi="Times New Roman"/>
+              </w:rPr>
+            </w:pPr>
+            <w:r>
+              <w:rPr>
+                <w:rFonts w:ascii="Times New Roman" w:cs="Times New Roman" w:eastAsia="Times New Roman" w:hAnsi="Times New Roman"/>
+                <w:rtl w:val="0"/>
+              </w:rPr>
+              <w:t xml:space="preserve">Total Person Hours</w:t>
+            </w:r>
+          </w:p>
+        </w:tc>
+        <w:tc>
+          <w:tcPr>
+            <w:shd w:fill="auto" w:val="clear"/>
+            <w:tcMar>
+              <w:top w:w="100.0" w:type="dxa"/>
+              <w:left w:w="100.0" w:type="dxa"/>
+              <w:bottom w:w="100.0" w:type="dxa"/>
+              <w:right w:w="100.0" w:type="dxa"/>
+            </w:tcMar>
+            <w:vAlign w:val="top"/>
+          </w:tcPr>
+          <w:p>
+            <w:pPr>
+              <w:widowControl w:val="0"/>
+              <w:spacing w:line="240" w:lineRule="auto"/>
+              <w:rPr>
+                <w:rFonts w:ascii="Times New Roman" w:cs="Times New Roman" w:eastAsia="Times New Roman" w:hAnsi="Times New Roman"/>
+              </w:rPr>
+            </w:pPr>
+            <w:r>
+              <w:rPr>
+                <w:rFonts w:ascii="Times New Roman" w:cs="Times New Roman" w:eastAsia="Times New Roman" w:hAnsi="Times New Roman"/>
+                <w:rtl w:val="0"/>
+              </w:rPr>
+              <w:t xml:space="preserve">Total development effort spent by team</w:t>
             </w:r>
           </w:p>
         </w:tc>
@@ -12715,7 +13509,7 @@
           <w:szCs w:val="24"/>
           <w:rtl w:val="0"/>
         </w:rPr>
-        <w:t xml:space="preserve">The application is planned to be deployed as a web application after the final iteration.</w:t>
+        <w:t xml:space="preserve">The application is planned to be deployed as a web application using Render after the final iteration.</w:t>
       </w:r>
       <w:r>
         <w:rPr>
@@ -12782,7 +13576,7 @@
           <w:szCs w:val="24"/>
           <w:rtl w:val="0"/>
         </w:rPr>
-        <w:t xml:space="preserve">We will be using Google’s coding standards for HTML/CSS and for Python. </w:t>
+        <w:t xml:space="preserve">We will be using Google’s coding standards for HTML/CSS, Javascript and Python throughout the project. The frontend is built using HTML, CSS, and JavaScript, while the automated tests are written in Python.</w:t>
       </w:r>
     </w:p>
     <w:p>
@@ -12953,8 +13747,8 @@
         </w:rPr>
         <w:t xml:space="preserve">We will be tracking which documents have been reviewed by which team members to make sure that everybody is on the same page. The</w:t>
       </w:r>
-      <w:commentRangeStart w:id="2"/>
       <w:commentRangeStart w:id="3"/>
+      <w:commentRangeStart w:id="4"/>
       <w:r>
         <w:rPr>
           <w:rFonts w:ascii="Times New Roman" w:cs="Times New Roman" w:eastAsia="Times New Roman" w:hAnsi="Times New Roman"/>
@@ -12964,13 +13758,13 @@
         </w:rPr>
         <w:t xml:space="preserve"> design/implementation leade</w:t>
       </w:r>
-      <w:commentRangeEnd w:id="2"/>
-      <w:r>
-        <w:commentReference w:id="2"/>
-      </w:r>
       <w:commentRangeEnd w:id="3"/>
       <w:r>
         <w:commentReference w:id="3"/>
+      </w:r>
+      <w:commentRangeEnd w:id="4"/>
+      <w:r>
+        <w:commentReference w:id="4"/>
       </w:r>
       <w:r>
         <w:rPr>
@@ -13319,7 +14113,7 @@
           <w:szCs w:val="24"/>
           <w:rtl w:val="0"/>
         </w:rPr>
-        <w:t xml:space="preserve">Delete the completed feature branch</w:t>
+        <w:t xml:space="preserve">Close the completed feature branch</w:t>
       </w:r>
     </w:p>
     <w:p>
@@ -13696,6 +14490,7 @@
       </w:pPr>
       <w:bookmarkStart w:colFirst="0" w:colLast="0" w:name="_l9xnpmd6hh0y" w:id="31"/>
       <w:bookmarkEnd w:id="31"/>
+      <w:commentRangeStart w:id="5"/>
       <w:r>
         <w:rPr>
           <w:rFonts w:ascii="Times New Roman" w:cs="Times New Roman" w:eastAsia="Times New Roman" w:hAnsi="Times New Roman"/>
@@ -13706,6 +14501,15 @@
           <w:rtl w:val="0"/>
         </w:rPr>
         <w:t xml:space="preserve">Testing  </w:t>
+      </w:r>
+      <w:commentRangeEnd w:id="5"/>
+      <w:r>
+        <w:commentReference w:id="5"/>
+      </w:r>
+      <w:r>
+        <w:rPr>
+          <w:rtl w:val="0"/>
+        </w:rPr>
       </w:r>
     </w:p>
     <w:p>
@@ -15116,8 +15920,12 @@
             </w:pPr>
             <w:r>
               <w:rPr>
+                <w:rFonts w:ascii="Times New Roman" w:cs="Times New Roman" w:eastAsia="Times New Roman" w:hAnsi="Times New Roman"/>
+                <w:sz w:val="24"/>
+                <w:szCs w:val="24"/>
                 <w:rtl w:val="0"/>
               </w:rPr>
+              <w:t xml:space="preserve">Team 3</w:t>
             </w:r>
           </w:p>
         </w:tc>
@@ -15343,8 +16151,474 @@
             </w:pPr>
             <w:r>
               <w:rPr>
+                <w:rFonts w:ascii="Times New Roman" w:cs="Times New Roman" w:eastAsia="Times New Roman" w:hAnsi="Times New Roman"/>
+                <w:sz w:val="24"/>
+                <w:szCs w:val="24"/>
                 <w:rtl w:val="0"/>
               </w:rPr>
+              <w:t xml:space="preserve">Team 3</w:t>
+            </w:r>
+          </w:p>
+        </w:tc>
+      </w:tr>
+      <w:tr>
+        <w:trPr>
+          <w:cantSplit w:val="0"/>
+          <w:tblHeader w:val="0"/>
+        </w:trPr>
+        <w:tc>
+          <w:tcPr>
+            <w:shd w:fill="auto" w:val="clear"/>
+            <w:tcMar>
+              <w:top w:w="100.0" w:type="dxa"/>
+              <w:left w:w="100.0" w:type="dxa"/>
+              <w:bottom w:w="100.0" w:type="dxa"/>
+              <w:right w:w="100.0" w:type="dxa"/>
+            </w:tcMar>
+            <w:vAlign w:val="top"/>
+          </w:tcPr>
+          <w:p>
+            <w:pPr>
+              <w:keepNext w:val="0"/>
+              <w:keepLines w:val="0"/>
+              <w:pageBreakBefore w:val="0"/>
+              <w:widowControl w:val="0"/>
+              <w:pBdr>
+                <w:top w:space="0" w:sz="0" w:val="nil"/>
+                <w:left w:space="0" w:sz="0" w:val="nil"/>
+                <w:bottom w:space="0" w:sz="0" w:val="nil"/>
+                <w:right w:space="0" w:sz="0" w:val="nil"/>
+                <w:between w:space="0" w:sz="0" w:val="nil"/>
+              </w:pBdr>
+              <w:shd w:fill="auto" w:val="clear"/>
+              <w:spacing w:after="0" w:before="0" w:line="276" w:lineRule="auto"/>
+              <w:ind w:left="0" w:right="0" w:firstLine="0"/>
+              <w:jc w:val="left"/>
+              <w:rPr>
+                <w:rFonts w:ascii="Times New Roman" w:cs="Times New Roman" w:eastAsia="Times New Roman" w:hAnsi="Times New Roman"/>
+                <w:sz w:val="24"/>
+                <w:szCs w:val="24"/>
+              </w:rPr>
+            </w:pPr>
+            <w:r>
+              <w:rPr>
+                <w:rFonts w:ascii="Times New Roman" w:cs="Times New Roman" w:eastAsia="Times New Roman" w:hAnsi="Times New Roman"/>
+                <w:sz w:val="24"/>
+                <w:szCs w:val="24"/>
+                <w:rtl w:val="0"/>
+              </w:rPr>
+              <w:t xml:space="preserve">4</w:t>
+            </w:r>
+          </w:p>
+        </w:tc>
+        <w:tc>
+          <w:tcPr>
+            <w:shd w:fill="auto" w:val="clear"/>
+            <w:tcMar>
+              <w:top w:w="100.0" w:type="dxa"/>
+              <w:left w:w="100.0" w:type="dxa"/>
+              <w:bottom w:w="100.0" w:type="dxa"/>
+              <w:right w:w="100.0" w:type="dxa"/>
+            </w:tcMar>
+            <w:vAlign w:val="top"/>
+          </w:tcPr>
+          <w:p>
+            <w:pPr>
+              <w:keepNext w:val="0"/>
+              <w:keepLines w:val="0"/>
+              <w:pageBreakBefore w:val="0"/>
+              <w:widowControl w:val="0"/>
+              <w:pBdr>
+                <w:top w:space="0" w:sz="0" w:val="nil"/>
+                <w:left w:space="0" w:sz="0" w:val="nil"/>
+                <w:bottom w:space="0" w:sz="0" w:val="nil"/>
+                <w:right w:space="0" w:sz="0" w:val="nil"/>
+                <w:between w:space="0" w:sz="0" w:val="nil"/>
+              </w:pBdr>
+              <w:shd w:fill="auto" w:val="clear"/>
+              <w:spacing w:after="0" w:before="0" w:line="276" w:lineRule="auto"/>
+              <w:ind w:left="0" w:right="0" w:firstLine="0"/>
+              <w:jc w:val="left"/>
+              <w:rPr>
+                <w:rFonts w:ascii="Times New Roman" w:cs="Times New Roman" w:eastAsia="Times New Roman" w:hAnsi="Times New Roman"/>
+                <w:sz w:val="24"/>
+                <w:szCs w:val="24"/>
+              </w:rPr>
+            </w:pPr>
+            <w:r>
+              <w:rPr>
+                <w:rFonts w:ascii="Times New Roman" w:cs="Times New Roman" w:eastAsia="Times New Roman" w:hAnsi="Times New Roman"/>
+                <w:sz w:val="24"/>
+                <w:szCs w:val="24"/>
+                <w:rtl w:val="0"/>
+              </w:rPr>
+              <w:t xml:space="preserve">Vy Trinh</w:t>
+            </w:r>
+          </w:p>
+        </w:tc>
+        <w:tc>
+          <w:tcPr>
+            <w:shd w:fill="auto" w:val="clear"/>
+            <w:tcMar>
+              <w:top w:w="100.0" w:type="dxa"/>
+              <w:left w:w="100.0" w:type="dxa"/>
+              <w:bottom w:w="100.0" w:type="dxa"/>
+              <w:right w:w="100.0" w:type="dxa"/>
+            </w:tcMar>
+            <w:vAlign w:val="top"/>
+          </w:tcPr>
+          <w:p>
+            <w:pPr>
+              <w:keepNext w:val="0"/>
+              <w:keepLines w:val="0"/>
+              <w:pageBreakBefore w:val="0"/>
+              <w:widowControl w:val="0"/>
+              <w:pBdr>
+                <w:top w:space="0" w:sz="0" w:val="nil"/>
+                <w:left w:space="0" w:sz="0" w:val="nil"/>
+                <w:bottom w:space="0" w:sz="0" w:val="nil"/>
+                <w:right w:space="0" w:sz="0" w:val="nil"/>
+                <w:between w:space="0" w:sz="0" w:val="nil"/>
+              </w:pBdr>
+              <w:shd w:fill="auto" w:val="clear"/>
+              <w:spacing w:after="0" w:before="0" w:line="276" w:lineRule="auto"/>
+              <w:ind w:left="0" w:right="0" w:firstLine="0"/>
+              <w:jc w:val="left"/>
+              <w:rPr>
+                <w:rFonts w:ascii="Times New Roman" w:cs="Times New Roman" w:eastAsia="Times New Roman" w:hAnsi="Times New Roman"/>
+                <w:sz w:val="24"/>
+                <w:szCs w:val="24"/>
+              </w:rPr>
+            </w:pPr>
+            <w:r>
+              <w:rPr>
+                <w:rFonts w:ascii="Times New Roman" w:cs="Times New Roman" w:eastAsia="Times New Roman" w:hAnsi="Times New Roman"/>
+                <w:sz w:val="24"/>
+                <w:szCs w:val="24"/>
+                <w:rtl w:val="0"/>
+              </w:rPr>
+              <w:t xml:space="preserve">10%</w:t>
+            </w:r>
+          </w:p>
+        </w:tc>
+        <w:tc>
+          <w:tcPr>
+            <w:shd w:fill="auto" w:val="clear"/>
+            <w:tcMar>
+              <w:top w:w="100.0" w:type="dxa"/>
+              <w:left w:w="100.0" w:type="dxa"/>
+              <w:bottom w:w="100.0" w:type="dxa"/>
+              <w:right w:w="100.0" w:type="dxa"/>
+            </w:tcMar>
+            <w:vAlign w:val="top"/>
+          </w:tcPr>
+          <w:p>
+            <w:pPr>
+              <w:keepNext w:val="0"/>
+              <w:keepLines w:val="0"/>
+              <w:pageBreakBefore w:val="0"/>
+              <w:widowControl w:val="0"/>
+              <w:pBdr>
+                <w:top w:space="0" w:sz="0" w:val="nil"/>
+                <w:left w:space="0" w:sz="0" w:val="nil"/>
+                <w:bottom w:space="0" w:sz="0" w:val="nil"/>
+                <w:right w:space="0" w:sz="0" w:val="nil"/>
+                <w:between w:space="0" w:sz="0" w:val="nil"/>
+              </w:pBdr>
+              <w:shd w:fill="auto" w:val="clear"/>
+              <w:spacing w:after="0" w:before="0" w:line="276" w:lineRule="auto"/>
+              <w:ind w:left="0" w:right="0" w:firstLine="0"/>
+              <w:jc w:val="left"/>
+              <w:rPr>
+                <w:rFonts w:ascii="Times New Roman" w:cs="Times New Roman" w:eastAsia="Times New Roman" w:hAnsi="Times New Roman"/>
+                <w:sz w:val="24"/>
+                <w:szCs w:val="24"/>
+              </w:rPr>
+            </w:pPr>
+            <w:r>
+              <w:rPr>
+                <w:rFonts w:ascii="Times New Roman" w:cs="Times New Roman" w:eastAsia="Times New Roman" w:hAnsi="Times New Roman"/>
+                <w:sz w:val="24"/>
+                <w:szCs w:val="24"/>
+                <w:rtl w:val="0"/>
+              </w:rPr>
+              <w:t xml:space="preserve">Used AI to suggest software engineering metrics, testing approaches, quality measures, and process metrics. Metrics were customized for the SpecCheck project.</w:t>
+            </w:r>
+          </w:p>
+        </w:tc>
+        <w:tc>
+          <w:tcPr>
+            <w:shd w:fill="auto" w:val="clear"/>
+            <w:tcMar>
+              <w:top w:w="100.0" w:type="dxa"/>
+              <w:left w:w="100.0" w:type="dxa"/>
+              <w:bottom w:w="100.0" w:type="dxa"/>
+              <w:right w:w="100.0" w:type="dxa"/>
+            </w:tcMar>
+            <w:vAlign w:val="top"/>
+          </w:tcPr>
+          <w:p>
+            <w:pPr>
+              <w:keepNext w:val="0"/>
+              <w:keepLines w:val="0"/>
+              <w:pageBreakBefore w:val="0"/>
+              <w:widowControl w:val="0"/>
+              <w:pBdr>
+                <w:top w:space="0" w:sz="0" w:val="nil"/>
+                <w:left w:space="0" w:sz="0" w:val="nil"/>
+                <w:bottom w:space="0" w:sz="0" w:val="nil"/>
+                <w:right w:space="0" w:sz="0" w:val="nil"/>
+                <w:between w:space="0" w:sz="0" w:val="nil"/>
+              </w:pBdr>
+              <w:shd w:fill="auto" w:val="clear"/>
+              <w:spacing w:after="0" w:before="0" w:line="276" w:lineRule="auto"/>
+              <w:ind w:left="0" w:right="0" w:firstLine="0"/>
+              <w:jc w:val="left"/>
+              <w:rPr>
+                <w:rFonts w:ascii="Times New Roman" w:cs="Times New Roman" w:eastAsia="Times New Roman" w:hAnsi="Times New Roman"/>
+                <w:sz w:val="24"/>
+                <w:szCs w:val="24"/>
+              </w:rPr>
+            </w:pPr>
+            <w:r>
+              <w:rPr>
+                <w:rFonts w:ascii="Times New Roman" w:cs="Times New Roman" w:eastAsia="Times New Roman" w:hAnsi="Times New Roman"/>
+                <w:sz w:val="24"/>
+                <w:szCs w:val="24"/>
+                <w:rtl w:val="0"/>
+              </w:rPr>
+              <w:t xml:space="preserve">Team 3</w:t>
+            </w:r>
+          </w:p>
+        </w:tc>
+      </w:tr>
+      <w:tr>
+        <w:trPr>
+          <w:cantSplit w:val="0"/>
+          <w:tblHeader w:val="0"/>
+        </w:trPr>
+        <w:tc>
+          <w:tcPr>
+            <w:shd w:fill="auto" w:val="clear"/>
+            <w:tcMar>
+              <w:top w:w="100.0" w:type="dxa"/>
+              <w:left w:w="100.0" w:type="dxa"/>
+              <w:bottom w:w="100.0" w:type="dxa"/>
+              <w:right w:w="100.0" w:type="dxa"/>
+            </w:tcMar>
+            <w:vAlign w:val="top"/>
+          </w:tcPr>
+          <w:p>
+            <w:pPr>
+              <w:keepNext w:val="0"/>
+              <w:keepLines w:val="0"/>
+              <w:pageBreakBefore w:val="0"/>
+              <w:widowControl w:val="0"/>
+              <w:pBdr>
+                <w:top w:space="0" w:sz="0" w:val="nil"/>
+                <w:left w:space="0" w:sz="0" w:val="nil"/>
+                <w:bottom w:space="0" w:sz="0" w:val="nil"/>
+                <w:right w:space="0" w:sz="0" w:val="nil"/>
+                <w:between w:space="0" w:sz="0" w:val="nil"/>
+              </w:pBdr>
+              <w:shd w:fill="auto" w:val="clear"/>
+              <w:spacing w:after="0" w:before="0" w:line="276" w:lineRule="auto"/>
+              <w:ind w:left="0" w:right="0" w:firstLine="0"/>
+              <w:jc w:val="left"/>
+              <w:rPr>
+                <w:rFonts w:ascii="Times New Roman" w:cs="Times New Roman" w:eastAsia="Times New Roman" w:hAnsi="Times New Roman"/>
+                <w:sz w:val="24"/>
+                <w:szCs w:val="24"/>
+              </w:rPr>
+            </w:pPr>
+            <w:r>
+              <w:rPr>
+                <w:rFonts w:ascii="Times New Roman" w:cs="Times New Roman" w:eastAsia="Times New Roman" w:hAnsi="Times New Roman"/>
+                <w:sz w:val="24"/>
+                <w:szCs w:val="24"/>
+                <w:rtl w:val="0"/>
+              </w:rPr>
+              <w:t xml:space="preserve">5</w:t>
+            </w:r>
+          </w:p>
+        </w:tc>
+        <w:tc>
+          <w:tcPr>
+            <w:shd w:fill="auto" w:val="clear"/>
+            <w:tcMar>
+              <w:top w:w="100.0" w:type="dxa"/>
+              <w:left w:w="100.0" w:type="dxa"/>
+              <w:bottom w:w="100.0" w:type="dxa"/>
+              <w:right w:w="100.0" w:type="dxa"/>
+            </w:tcMar>
+            <w:vAlign w:val="top"/>
+          </w:tcPr>
+          <w:p>
+            <w:pPr>
+              <w:keepNext w:val="0"/>
+              <w:keepLines w:val="0"/>
+              <w:pageBreakBefore w:val="0"/>
+              <w:widowControl w:val="0"/>
+              <w:pBdr>
+                <w:top w:space="0" w:sz="0" w:val="nil"/>
+                <w:left w:space="0" w:sz="0" w:val="nil"/>
+                <w:bottom w:space="0" w:sz="0" w:val="nil"/>
+                <w:right w:space="0" w:sz="0" w:val="nil"/>
+                <w:between w:space="0" w:sz="0" w:val="nil"/>
+              </w:pBdr>
+              <w:shd w:fill="auto" w:val="clear"/>
+              <w:spacing w:after="0" w:before="0" w:line="276" w:lineRule="auto"/>
+              <w:ind w:left="0" w:right="0" w:firstLine="0"/>
+              <w:jc w:val="left"/>
+              <w:rPr>
+                <w:rFonts w:ascii="Times New Roman" w:cs="Times New Roman" w:eastAsia="Times New Roman" w:hAnsi="Times New Roman"/>
+                <w:sz w:val="24"/>
+                <w:szCs w:val="24"/>
+              </w:rPr>
+            </w:pPr>
+            <w:r>
+              <w:rPr>
+                <w:rFonts w:ascii="Times New Roman" w:cs="Times New Roman" w:eastAsia="Times New Roman" w:hAnsi="Times New Roman"/>
+                <w:sz w:val="24"/>
+                <w:szCs w:val="24"/>
+                <w:rtl w:val="0"/>
+              </w:rPr>
+              <w:t xml:space="preserve">Vy Trinh</w:t>
+            </w:r>
+          </w:p>
+        </w:tc>
+        <w:tc>
+          <w:tcPr>
+            <w:shd w:fill="auto" w:val="clear"/>
+            <w:tcMar>
+              <w:top w:w="100.0" w:type="dxa"/>
+              <w:left w:w="100.0" w:type="dxa"/>
+              <w:bottom w:w="100.0" w:type="dxa"/>
+              <w:right w:w="100.0" w:type="dxa"/>
+            </w:tcMar>
+            <w:vAlign w:val="top"/>
+          </w:tcPr>
+          <w:p>
+            <w:pPr>
+              <w:keepNext w:val="0"/>
+              <w:keepLines w:val="0"/>
+              <w:pageBreakBefore w:val="0"/>
+              <w:widowControl w:val="0"/>
+              <w:pBdr>
+                <w:top w:space="0" w:sz="0" w:val="nil"/>
+                <w:left w:space="0" w:sz="0" w:val="nil"/>
+                <w:bottom w:space="0" w:sz="0" w:val="nil"/>
+                <w:right w:space="0" w:sz="0" w:val="nil"/>
+                <w:between w:space="0" w:sz="0" w:val="nil"/>
+              </w:pBdr>
+              <w:shd w:fill="auto" w:val="clear"/>
+              <w:spacing w:after="0" w:before="0" w:line="276" w:lineRule="auto"/>
+              <w:ind w:left="0" w:right="0" w:firstLine="0"/>
+              <w:jc w:val="left"/>
+              <w:rPr>
+                <w:rFonts w:ascii="Times New Roman" w:cs="Times New Roman" w:eastAsia="Times New Roman" w:hAnsi="Times New Roman"/>
+                <w:sz w:val="24"/>
+                <w:szCs w:val="24"/>
+              </w:rPr>
+            </w:pPr>
+            <w:r>
+              <w:rPr>
+                <w:rFonts w:ascii="Times New Roman" w:cs="Times New Roman" w:eastAsia="Times New Roman" w:hAnsi="Times New Roman"/>
+                <w:sz w:val="24"/>
+                <w:szCs w:val="24"/>
+                <w:rtl w:val="0"/>
+              </w:rPr>
+              <w:t xml:space="preserve">15%</w:t>
+            </w:r>
+          </w:p>
+        </w:tc>
+        <w:tc>
+          <w:tcPr>
+            <w:shd w:fill="auto" w:val="clear"/>
+            <w:tcMar>
+              <w:top w:w="100.0" w:type="dxa"/>
+              <w:left w:w="100.0" w:type="dxa"/>
+              <w:bottom w:w="100.0" w:type="dxa"/>
+              <w:right w:w="100.0" w:type="dxa"/>
+            </w:tcMar>
+            <w:vAlign w:val="top"/>
+          </w:tcPr>
+          <w:p>
+            <w:pPr>
+              <w:keepNext w:val="0"/>
+              <w:keepLines w:val="0"/>
+              <w:pageBreakBefore w:val="0"/>
+              <w:widowControl w:val="0"/>
+              <w:pBdr>
+                <w:top w:space="0" w:sz="0" w:val="nil"/>
+                <w:left w:space="0" w:sz="0" w:val="nil"/>
+                <w:bottom w:space="0" w:sz="0" w:val="nil"/>
+                <w:right w:space="0" w:sz="0" w:val="nil"/>
+                <w:between w:space="0" w:sz="0" w:val="nil"/>
+              </w:pBdr>
+              <w:shd w:fill="auto" w:val="clear"/>
+              <w:spacing w:after="0" w:before="0" w:line="276" w:lineRule="auto"/>
+              <w:ind w:left="0" w:right="0" w:firstLine="0"/>
+              <w:jc w:val="left"/>
+              <w:rPr>
+                <w:rFonts w:ascii="Times New Roman" w:cs="Times New Roman" w:eastAsia="Times New Roman" w:hAnsi="Times New Roman"/>
+                <w:sz w:val="24"/>
+                <w:szCs w:val="24"/>
+              </w:rPr>
+            </w:pPr>
+            <w:r>
+              <w:rPr>
+                <w:rFonts w:ascii="Times New Roman" w:cs="Times New Roman" w:eastAsia="Times New Roman" w:hAnsi="Times New Roman"/>
+                <w:sz w:val="24"/>
+                <w:szCs w:val="24"/>
+                <w:rtl w:val="0"/>
+              </w:rPr>
+              <w:t xml:space="preserve">Used AI to generate examples for Git branching strategy, CI/CD workflow descriptions, code review process, and defect management practices</w:t>
+            </w:r>
+          </w:p>
+        </w:tc>
+        <w:tc>
+          <w:tcPr>
+            <w:shd w:fill="auto" w:val="clear"/>
+            <w:tcMar>
+              <w:top w:w="100.0" w:type="dxa"/>
+              <w:left w:w="100.0" w:type="dxa"/>
+              <w:bottom w:w="100.0" w:type="dxa"/>
+              <w:right w:w="100.0" w:type="dxa"/>
+            </w:tcMar>
+            <w:vAlign w:val="top"/>
+          </w:tcPr>
+          <w:p>
+            <w:pPr>
+              <w:keepNext w:val="0"/>
+              <w:keepLines w:val="0"/>
+              <w:pageBreakBefore w:val="0"/>
+              <w:widowControl w:val="0"/>
+              <w:pBdr>
+                <w:top w:space="0" w:sz="0" w:val="nil"/>
+                <w:left w:space="0" w:sz="0" w:val="nil"/>
+                <w:bottom w:space="0" w:sz="0" w:val="nil"/>
+                <w:right w:space="0" w:sz="0" w:val="nil"/>
+                <w:between w:space="0" w:sz="0" w:val="nil"/>
+              </w:pBdr>
+              <w:shd w:fill="auto" w:val="clear"/>
+              <w:spacing w:after="0" w:before="0" w:line="276" w:lineRule="auto"/>
+              <w:ind w:left="0" w:right="0" w:firstLine="0"/>
+              <w:jc w:val="left"/>
+              <w:rPr>
+                <w:rFonts w:ascii="Times New Roman" w:cs="Times New Roman" w:eastAsia="Times New Roman" w:hAnsi="Times New Roman"/>
+                <w:sz w:val="24"/>
+                <w:szCs w:val="24"/>
+              </w:rPr>
+            </w:pPr>
+            <w:r>
+              <w:rPr>
+                <w:rFonts w:ascii="Times New Roman" w:cs="Times New Roman" w:eastAsia="Times New Roman" w:hAnsi="Times New Roman"/>
+                <w:sz w:val="24"/>
+                <w:szCs w:val="24"/>
+                <w:rtl w:val="0"/>
+              </w:rPr>
+              <w:t xml:space="preserve">Team 3</w:t>
             </w:r>
           </w:p>
         </w:tc>
@@ -15708,7 +16982,7 @@
 
 <file path=word/comments.xml><?xml version="1.0" encoding="utf-8"?>
 <w:comments xmlns:mc="http://schemas.openxmlformats.org/markup-compatibility/2006" xmlns:o="urn:schemas-microsoft-com:office:office" xmlns:r="http://schemas.openxmlformats.org/officeDocument/2006/relationships" xmlns:m="http://schemas.openxmlformats.org/officeDocument/2006/math" xmlns:v="urn:schemas-microsoft-com:vml" xmlns:wp="http://schemas.openxmlformats.org/drawingml/2006/wordprocessingDrawing" xmlns:w10="urn:schemas-microsoft-com:office:word" xmlns:w="http://schemas.openxmlformats.org/wordprocessingml/2006/main" xmlns:wne="http://schemas.microsoft.com/office/word/2006/wordml" xmlns:sl="http://schemas.openxmlformats.org/schemaLibrary/2006/main" xmlns:a="http://schemas.openxmlformats.org/drawingml/2006/main" xmlns:pic="http://schemas.openxmlformats.org/drawingml/2006/picture" xmlns:c="http://schemas.openxmlformats.org/drawingml/2006/chart" xmlns:lc="http://schemas.openxmlformats.org/drawingml/2006/lockedCanvas" xmlns:dgm="http://schemas.openxmlformats.org/drawingml/2006/diagram" xmlns:wps="http://schemas.microsoft.com/office/word/2010/wordprocessingShape" xmlns:wpg="http://schemas.microsoft.com/office/word/2010/wordprocessingGroup" xmlns:w14="http://schemas.microsoft.com/office/word/2010/wordml" xmlns:w15="http://schemas.microsoft.com/office/word/2012/wordml" xmlns:w16="http://schemas.microsoft.com/office/word/2018/wordml" xmlns:w16cex="http://schemas.microsoft.com/office/word/2018/wordml/cex" xmlns:w16cid="http://schemas.microsoft.com/office/word/2016/wordml/cid" xmlns="http://schemas.microsoft.com/office/tasks/2019/documenttasks" xmlns:cr="http://schemas.microsoft.com/office/comments/2020/reactions">
-  <w:comment w:author="Yuting Zhang" w:id="2" w:date="2026-05-16T21:26:46Z">
+  <w:comment w:author="Yuting Zhang" w:id="3" w:date="2026-05-16T21:26:46Z">
     <w:p>
       <w:pPr>
         <w:keepNext w:val="0"/>
@@ -15763,7 +17037,7 @@
       </w:r>
     </w:p>
   </w:comment>
-  <w:comment w:author="Jannatul Tuba" w:id="3" w:date="2026-05-26T00:23:12Z">
+  <w:comment w:author="Jannatul Tuba" w:id="4" w:date="2026-05-26T00:23:12Z">
     <w:p>
       <w:pPr>
         <w:keepNext w:val="0"/>
@@ -15818,7 +17092,7 @@
       </w:r>
     </w:p>
   </w:comment>
-  <w:comment w:author="Yuting Zhang" w:id="0" w:date="2026-05-16T21:39:46Z">
+  <w:comment w:author="Danielle Leask" w:id="5" w:date="2026-06-08T01:52:21Z">
     <w:p>
       <w:pPr>
         <w:keepNext w:val="0"/>
@@ -15869,11 +17143,121 @@
           <w:vertAlign w:val="baseline"/>
           <w:rtl w:val="0"/>
         </w:rPr>
+        <w:t xml:space="preserve">add unit testing in next iteration</w:t>
+      </w:r>
+    </w:p>
+  </w:comment>
+  <w:comment w:author="Yuting Zhang" w:id="0" w:date="2026-05-16T21:39:46Z">
+    <w:p>
+      <w:pPr>
+        <w:keepNext w:val="0"/>
+        <w:keepLines w:val="0"/>
+        <w:pageBreakBefore w:val="0"/>
+        <w:widowControl w:val="0"/>
+        <w:pBdr>
+          <w:top w:space="0" w:sz="0" w:val="nil"/>
+          <w:left w:space="0" w:sz="0" w:val="nil"/>
+          <w:bottom w:space="0" w:sz="0" w:val="nil"/>
+          <w:right w:space="0" w:sz="0" w:val="nil"/>
+          <w:between w:space="0" w:sz="0" w:val="nil"/>
+        </w:pBdr>
+        <w:shd w:fill="auto" w:val="clear"/>
+        <w:spacing w:after="0" w:before="0" w:line="240" w:lineRule="auto"/>
+        <w:ind w:left="0" w:right="0" w:firstLine="0"/>
+        <w:jc w:val="left"/>
+        <w:rPr>
+          <w:rFonts w:ascii="Arial" w:cs="Arial" w:eastAsia="Arial" w:hAnsi="Arial"/>
+          <w:b w:val="0"/>
+          <w:bCs w:val="0"/>
+          <w:i w:val="0"/>
+          <w:iCs w:val="0"/>
+          <w:smallCaps w:val="0"/>
+          <w:strike w:val="0"/>
+          <w:color w:val="000000"/>
+          <w:sz w:val="22"/>
+          <w:szCs w:val="22"/>
+          <w:u w:val="none"/>
+          <w:shd w:fill="auto" w:val="clear"/>
+          <w:vertAlign w:val="baseline"/>
+        </w:rPr>
+      </w:pPr>
+      <w:r>
+        <w:rPr>
+          <w:rFonts w:ascii="Arial" w:cs="Arial" w:eastAsia="Arial" w:hAnsi="Arial"/>
+          <w:b w:val="0"/>
+          <w:bCs w:val="0"/>
+          <w:i w:val="0"/>
+          <w:iCs w:val="0"/>
+          <w:smallCaps w:val="0"/>
+          <w:strike w:val="0"/>
+          <w:color w:val="000000"/>
+          <w:sz w:val="22"/>
+          <w:szCs w:val="22"/>
+          <w:u w:val="none"/>
+          <w:shd w:fill="auto" w:val="clear"/>
+          <w:vertAlign w:val="baseline"/>
+          <w:rtl w:val="0"/>
+        </w:rPr>
         <w:t xml:space="preserve">will your app focus on provide a specialized model or just use existing AI model API?</w:t>
       </w:r>
     </w:p>
   </w:comment>
-  <w:comment w:author="Yuting Zhang" w:id="1" w:date="2026-05-16T21:24:00Z">
+  <w:comment w:author="Vy Trinh" w:id="1" w:date="2026-06-07T04:19:57Z">
+    <w:p>
+      <w:pPr>
+        <w:keepNext w:val="0"/>
+        <w:keepLines w:val="0"/>
+        <w:pageBreakBefore w:val="0"/>
+        <w:widowControl w:val="0"/>
+        <w:pBdr>
+          <w:top w:space="0" w:sz="0" w:val="nil"/>
+          <w:left w:space="0" w:sz="0" w:val="nil"/>
+          <w:bottom w:space="0" w:sz="0" w:val="nil"/>
+          <w:right w:space="0" w:sz="0" w:val="nil"/>
+          <w:between w:space="0" w:sz="0" w:val="nil"/>
+        </w:pBdr>
+        <w:shd w:fill="auto" w:val="clear"/>
+        <w:spacing w:after="0" w:before="0" w:line="240" w:lineRule="auto"/>
+        <w:ind w:left="0" w:right="0" w:firstLine="0"/>
+        <w:jc w:val="left"/>
+        <w:rPr>
+          <w:rFonts w:ascii="Arial" w:cs="Arial" w:eastAsia="Arial" w:hAnsi="Arial"/>
+          <w:b w:val="0"/>
+          <w:bCs w:val="0"/>
+          <w:i w:val="0"/>
+          <w:iCs w:val="0"/>
+          <w:smallCaps w:val="0"/>
+          <w:strike w:val="0"/>
+          <w:color w:val="000000"/>
+          <w:sz w:val="22"/>
+          <w:szCs w:val="22"/>
+          <w:u w:val="none"/>
+          <w:shd w:fill="auto" w:val="clear"/>
+          <w:vertAlign w:val="baseline"/>
+        </w:rPr>
+      </w:pPr>
+      <w:r>
+        <w:rPr>
+          <w:rFonts w:ascii="Arial" w:cs="Arial" w:eastAsia="Arial" w:hAnsi="Arial"/>
+          <w:b w:val="0"/>
+          <w:bCs w:val="0"/>
+          <w:i w:val="0"/>
+          <w:iCs w:val="0"/>
+          <w:smallCaps w:val="0"/>
+          <w:strike w:val="0"/>
+          <w:color w:val="000000"/>
+          <w:sz w:val="22"/>
+          <w:szCs w:val="22"/>
+          <w:u w:val="none"/>
+          <w:shd w:fill="auto" w:val="clear"/>
+          <w:vertAlign w:val="baseline"/>
+          <w:rtl w:val="0"/>
+        </w:rPr>
+        <w:t xml:space="preserve">We will use existing AI model API</w:t>
+      </w:r>
+    </w:p>
+  </w:comment>
+  <w:comment w:author="Yuting Zhang" w:id="2" w:date="2026-05-16T21:24:00Z">
     <w:p>
       <w:pPr>
         <w:keepNext w:val="0"/>

</xml_diff>